<commit_message>
docs: agregar requerimientos funcionales (crear ticket, categorizar fallo, asignar tecnico)
</commit_message>
<xml_diff>
--- a/Actividad_1/analisis/Analisis_Incidentes.docx
+++ b/Actividad_1/analisis/Analisis_Incidentes.docx
@@ -1846,6 +1846,1526 @@
         </w:rPr>
       </w:pPr>
     </w:p>
+    <w:p>
+      <w:pPr>
+        <w:pStyle w:val="Sinespaciado"/>
+        <w:spacing w:line="360" w:lineRule="auto"/>
+        <w:jc w:val="both"/>
+        <w:rPr>
+          <w:rFonts w:ascii="Arial" w:hAnsi="Arial" w:cs="Arial"/>
+          <w:b/>
+          <w:bCs/>
+          <w:lang w:val="es-ES" w:eastAsia="es-EC"/>
+        </w:rPr>
+      </w:pPr>
+      <w:r>
+        <w:rPr>
+          <w:rFonts w:ascii="Arial" w:hAnsi="Arial" w:cs="Arial"/>
+          <w:b/>
+          <w:bCs/>
+          <w:lang w:val="es-ES" w:eastAsia="es-EC"/>
+        </w:rPr>
+        <w:t>Requerimientos Funcionales</w:t>
+      </w:r>
+    </w:p>
+    <w:tbl>
+      <w:tblPr>
+        <w:tblStyle w:val="Tablaconcuadrculaclara"/>
+        <w:tblW w:w="0" w:type="auto"/>
+        <w:tblLook w:val="04A0" w:firstRow="1" w:lastRow="0" w:firstColumn="1" w:lastColumn="0" w:noHBand="0" w:noVBand="1"/>
+      </w:tblPr>
+      <w:tblGrid>
+        <w:gridCol w:w="620"/>
+        <w:gridCol w:w="1963"/>
+        <w:gridCol w:w="3009"/>
+        <w:gridCol w:w="1720"/>
+        <w:gridCol w:w="1182"/>
+      </w:tblGrid>
+      <w:tr>
+        <w:tc>
+          <w:tcPr>
+            <w:tcW w:w="0" w:type="auto"/>
+            <w:vAlign w:val="center"/>
+            <w:hideMark/>
+          </w:tcPr>
+          <w:p>
+            <w:pPr>
+              <w:pStyle w:val="Sinespaciado"/>
+              <w:jc w:val="center"/>
+              <w:rPr>
+                <w:rFonts w:ascii="Arial" w:hAnsi="Arial" w:cs="Arial"/>
+                <w:b/>
+                <w:bCs/>
+                <w:lang w:val="es-ES" w:eastAsia="es-EC"/>
+              </w:rPr>
+            </w:pPr>
+            <w:r>
+              <w:rPr>
+                <w:rFonts w:ascii="Arial" w:hAnsi="Arial" w:cs="Arial"/>
+                <w:b/>
+                <w:bCs/>
+                <w:lang w:val="es-ES" w:eastAsia="es-EC"/>
+              </w:rPr>
+              <w:t>ID</w:t>
+            </w:r>
+          </w:p>
+        </w:tc>
+        <w:tc>
+          <w:tcPr>
+            <w:tcW w:w="0" w:type="auto"/>
+            <w:vAlign w:val="center"/>
+            <w:hideMark/>
+          </w:tcPr>
+          <w:p>
+            <w:pPr>
+              <w:pStyle w:val="Sinespaciado"/>
+              <w:jc w:val="center"/>
+              <w:rPr>
+                <w:rFonts w:ascii="Arial" w:hAnsi="Arial" w:cs="Arial"/>
+                <w:b/>
+                <w:bCs/>
+                <w:lang w:val="es-ES" w:eastAsia="es-EC"/>
+              </w:rPr>
+            </w:pPr>
+            <w:r>
+              <w:rPr>
+                <w:rFonts w:ascii="Arial" w:hAnsi="Arial" w:cs="Arial"/>
+                <w:b/>
+                <w:bCs/>
+                <w:lang w:val="es-ES" w:eastAsia="es-EC"/>
+              </w:rPr>
+              <w:t>Requerimiento Funcional</w:t>
+            </w:r>
+          </w:p>
+        </w:tc>
+        <w:tc>
+          <w:tcPr>
+            <w:tcW w:w="0" w:type="auto"/>
+            <w:vAlign w:val="center"/>
+            <w:hideMark/>
+          </w:tcPr>
+          <w:p>
+            <w:pPr>
+              <w:pStyle w:val="Sinespaciado"/>
+              <w:jc w:val="center"/>
+              <w:rPr>
+                <w:rFonts w:ascii="Arial" w:hAnsi="Arial" w:cs="Arial"/>
+                <w:b/>
+                <w:bCs/>
+                <w:lang w:val="es-ES" w:eastAsia="es-EC"/>
+              </w:rPr>
+            </w:pPr>
+            <w:r>
+              <w:rPr>
+                <w:rFonts w:ascii="Arial" w:hAnsi="Arial" w:cs="Arial"/>
+                <w:b/>
+                <w:bCs/>
+                <w:lang w:val="es-ES" w:eastAsia="es-EC"/>
+              </w:rPr>
+              <w:t>Descripción</w:t>
+            </w:r>
+          </w:p>
+        </w:tc>
+        <w:tc>
+          <w:tcPr>
+            <w:tcW w:w="0" w:type="auto"/>
+            <w:vAlign w:val="center"/>
+            <w:hideMark/>
+          </w:tcPr>
+          <w:p>
+            <w:pPr>
+              <w:pStyle w:val="Sinespaciado"/>
+              <w:jc w:val="center"/>
+              <w:rPr>
+                <w:rFonts w:ascii="Arial" w:hAnsi="Arial" w:cs="Arial"/>
+                <w:b/>
+                <w:bCs/>
+                <w:lang w:val="es-ES" w:eastAsia="es-EC"/>
+              </w:rPr>
+            </w:pPr>
+            <w:r>
+              <w:rPr>
+                <w:rFonts w:ascii="Arial" w:hAnsi="Arial" w:cs="Arial"/>
+                <w:b/>
+                <w:bCs/>
+                <w:lang w:val="es-ES" w:eastAsia="es-EC"/>
+              </w:rPr>
+              <w:t>Actor Principal</w:t>
+            </w:r>
+          </w:p>
+        </w:tc>
+        <w:tc>
+          <w:tcPr>
+            <w:tcW w:w="0" w:type="auto"/>
+            <w:vAlign w:val="center"/>
+            <w:hideMark/>
+          </w:tcPr>
+          <w:p>
+            <w:pPr>
+              <w:pStyle w:val="Sinespaciado"/>
+              <w:jc w:val="center"/>
+              <w:rPr>
+                <w:rFonts w:ascii="Arial" w:hAnsi="Arial" w:cs="Arial"/>
+                <w:b/>
+                <w:bCs/>
+                <w:lang w:val="es-ES" w:eastAsia="es-EC"/>
+              </w:rPr>
+            </w:pPr>
+            <w:r>
+              <w:rPr>
+                <w:rFonts w:ascii="Arial" w:hAnsi="Arial" w:cs="Arial"/>
+                <w:b/>
+                <w:bCs/>
+                <w:lang w:val="es-ES" w:eastAsia="es-EC"/>
+              </w:rPr>
+              <w:t>Prioridad</w:t>
+            </w:r>
+          </w:p>
+        </w:tc>
+      </w:tr>
+      <w:tr>
+        <w:tc>
+          <w:tcPr>
+            <w:tcW w:w="0" w:type="auto"/>
+            <w:vAlign w:val="center"/>
+            <w:hideMark/>
+          </w:tcPr>
+          <w:p>
+            <w:pPr>
+              <w:pStyle w:val="Sinespaciado"/>
+              <w:jc w:val="center"/>
+              <w:rPr>
+                <w:rFonts w:ascii="Arial" w:hAnsi="Arial" w:cs="Arial"/>
+                <w:lang w:val="es-ES" w:eastAsia="es-EC"/>
+              </w:rPr>
+            </w:pPr>
+            <w:r>
+              <w:rPr>
+                <w:rFonts w:ascii="Arial" w:hAnsi="Arial" w:cs="Arial"/>
+                <w:lang w:val="es-ES" w:eastAsia="es-EC"/>
+              </w:rPr>
+              <w:t>RF-01</w:t>
+            </w:r>
+          </w:p>
+        </w:tc>
+        <w:tc>
+          <w:tcPr>
+            <w:tcW w:w="0" w:type="auto"/>
+            <w:vAlign w:val="center"/>
+            <w:hideMark/>
+          </w:tcPr>
+          <w:p>
+            <w:pPr>
+              <w:pStyle w:val="Sinespaciado"/>
+              <w:jc w:val="center"/>
+              <w:rPr>
+                <w:rFonts w:ascii="Arial" w:hAnsi="Arial" w:cs="Arial"/>
+                <w:lang w:val="es-ES" w:eastAsia="es-EC"/>
+              </w:rPr>
+            </w:pPr>
+            <w:r>
+              <w:rPr>
+                <w:rFonts w:ascii="Arial" w:hAnsi="Arial" w:cs="Arial"/>
+                <w:lang w:val="es-ES" w:eastAsia="es-EC"/>
+              </w:rPr>
+              <w:t>Registro de Incidentes</w:t>
+            </w:r>
+          </w:p>
+        </w:tc>
+        <w:tc>
+          <w:tcPr>
+            <w:tcW w:w="0" w:type="auto"/>
+            <w:vAlign w:val="center"/>
+            <w:hideMark/>
+          </w:tcPr>
+          <w:p>
+            <w:pPr>
+              <w:pStyle w:val="Sinespaciado"/>
+              <w:rPr>
+                <w:rFonts w:ascii="Arial" w:hAnsi="Arial" w:cs="Arial"/>
+                <w:lang w:val="es-ES" w:eastAsia="es-EC"/>
+              </w:rPr>
+            </w:pPr>
+            <w:r>
+              <w:rPr>
+                <w:rFonts w:ascii="Arial" w:hAnsi="Arial" w:cs="Arial"/>
+                <w:lang w:val="es-ES" w:eastAsia="es-EC"/>
+              </w:rPr>
+              <w:t xml:space="preserve">Permitir la creación de </w:t>
+            </w:r>
+            <w:proofErr w:type="gramStart"/>
+            <w:r>
+              <w:rPr>
+                <w:rFonts w:ascii="Arial" w:hAnsi="Arial" w:cs="Arial"/>
+                <w:lang w:val="es-ES" w:eastAsia="es-EC"/>
+              </w:rPr>
+              <w:t>tickets</w:t>
+            </w:r>
+            <w:proofErr w:type="gramEnd"/>
+            <w:r>
+              <w:rPr>
+                <w:rFonts w:ascii="Arial" w:hAnsi="Arial" w:cs="Arial"/>
+                <w:lang w:val="es-ES" w:eastAsia="es-EC"/>
+              </w:rPr>
+              <w:t xml:space="preserve"> con título, </w:t>
+            </w:r>
+            <w:r>
+              <w:rPr>
+                <w:rFonts w:ascii="Arial" w:hAnsi="Arial" w:cs="Arial"/>
+                <w:lang w:val="es-ES" w:eastAsia="es-EC"/>
+              </w:rPr>
+              <w:lastRenderedPageBreak/>
+              <w:t>descripción detallada y evidencia (capturas)</w:t>
+            </w:r>
+          </w:p>
+        </w:tc>
+        <w:tc>
+          <w:tcPr>
+            <w:tcW w:w="0" w:type="auto"/>
+            <w:vAlign w:val="center"/>
+            <w:hideMark/>
+          </w:tcPr>
+          <w:p>
+            <w:pPr>
+              <w:pStyle w:val="Sinespaciado"/>
+              <w:jc w:val="center"/>
+              <w:rPr>
+                <w:rFonts w:ascii="Arial" w:hAnsi="Arial" w:cs="Arial"/>
+                <w:lang w:val="es-ES" w:eastAsia="es-EC"/>
+              </w:rPr>
+            </w:pPr>
+            <w:r>
+              <w:rPr>
+                <w:rFonts w:ascii="Arial" w:hAnsi="Arial" w:cs="Arial"/>
+                <w:lang w:val="es-ES" w:eastAsia="es-EC"/>
+              </w:rPr>
+              <w:lastRenderedPageBreak/>
+              <w:t>Usuario Final</w:t>
+            </w:r>
+          </w:p>
+        </w:tc>
+        <w:tc>
+          <w:tcPr>
+            <w:tcW w:w="0" w:type="auto"/>
+            <w:vAlign w:val="center"/>
+            <w:hideMark/>
+          </w:tcPr>
+          <w:p>
+            <w:pPr>
+              <w:pStyle w:val="Sinespaciado"/>
+              <w:jc w:val="center"/>
+              <w:rPr>
+                <w:rFonts w:ascii="Arial" w:hAnsi="Arial" w:cs="Arial"/>
+                <w:lang w:val="es-ES" w:eastAsia="es-EC"/>
+              </w:rPr>
+            </w:pPr>
+            <w:r>
+              <w:rPr>
+                <w:rFonts w:ascii="Arial" w:hAnsi="Arial" w:cs="Arial"/>
+                <w:lang w:val="es-ES" w:eastAsia="es-EC"/>
+              </w:rPr>
+              <w:t>Alta</w:t>
+            </w:r>
+          </w:p>
+        </w:tc>
+      </w:tr>
+      <w:tr>
+        <w:tc>
+          <w:tcPr>
+            <w:tcW w:w="0" w:type="auto"/>
+            <w:vAlign w:val="center"/>
+            <w:hideMark/>
+          </w:tcPr>
+          <w:p>
+            <w:pPr>
+              <w:pStyle w:val="Sinespaciado"/>
+              <w:jc w:val="center"/>
+              <w:rPr>
+                <w:rFonts w:ascii="Arial" w:hAnsi="Arial" w:cs="Arial"/>
+                <w:lang w:val="es-ES" w:eastAsia="es-EC"/>
+              </w:rPr>
+            </w:pPr>
+            <w:r>
+              <w:rPr>
+                <w:rFonts w:ascii="Arial" w:hAnsi="Arial" w:cs="Arial"/>
+                <w:lang w:val="es-ES" w:eastAsia="es-EC"/>
+              </w:rPr>
+              <w:t>RF-02</w:t>
+            </w:r>
+          </w:p>
+        </w:tc>
+        <w:tc>
+          <w:tcPr>
+            <w:tcW w:w="0" w:type="auto"/>
+            <w:vAlign w:val="center"/>
+            <w:hideMark/>
+          </w:tcPr>
+          <w:p>
+            <w:pPr>
+              <w:pStyle w:val="Sinespaciado"/>
+              <w:jc w:val="center"/>
+              <w:rPr>
+                <w:rFonts w:ascii="Arial" w:hAnsi="Arial" w:cs="Arial"/>
+                <w:lang w:val="es-ES" w:eastAsia="es-EC"/>
+              </w:rPr>
+            </w:pPr>
+            <w:r>
+              <w:rPr>
+                <w:rFonts w:ascii="Arial" w:hAnsi="Arial" w:cs="Arial"/>
+                <w:lang w:val="es-ES" w:eastAsia="es-EC"/>
+              </w:rPr>
+              <w:t>Categorización de Fallos</w:t>
+            </w:r>
+          </w:p>
+        </w:tc>
+        <w:tc>
+          <w:tcPr>
+            <w:tcW w:w="0" w:type="auto"/>
+            <w:vAlign w:val="center"/>
+            <w:hideMark/>
+          </w:tcPr>
+          <w:p>
+            <w:pPr>
+              <w:pStyle w:val="Sinespaciado"/>
+              <w:rPr>
+                <w:rFonts w:ascii="Arial" w:hAnsi="Arial" w:cs="Arial"/>
+                <w:lang w:val="es-ES" w:eastAsia="es-EC"/>
+              </w:rPr>
+            </w:pPr>
+            <w:r>
+              <w:rPr>
+                <w:rFonts w:ascii="Arial" w:hAnsi="Arial" w:cs="Arial"/>
+                <w:lang w:val="es-ES" w:eastAsia="es-EC"/>
+              </w:rPr>
+              <w:t xml:space="preserve">Clasificar </w:t>
+            </w:r>
+            <w:proofErr w:type="gramStart"/>
+            <w:r>
+              <w:rPr>
+                <w:rFonts w:ascii="Arial" w:hAnsi="Arial" w:cs="Arial"/>
+                <w:lang w:val="es-ES" w:eastAsia="es-EC"/>
+              </w:rPr>
+              <w:t>automáticamente o manualmente</w:t>
+            </w:r>
+            <w:proofErr w:type="gramEnd"/>
+            <w:r>
+              <w:rPr>
+                <w:rFonts w:ascii="Arial" w:hAnsi="Arial" w:cs="Arial"/>
+                <w:lang w:val="es-ES" w:eastAsia="es-EC"/>
+              </w:rPr>
+              <w:t xml:space="preserve"> el incidente en: Hardware, Red, Software u Otros</w:t>
+            </w:r>
+          </w:p>
+        </w:tc>
+        <w:tc>
+          <w:tcPr>
+            <w:tcW w:w="0" w:type="auto"/>
+            <w:vAlign w:val="center"/>
+            <w:hideMark/>
+          </w:tcPr>
+          <w:p>
+            <w:pPr>
+              <w:pStyle w:val="Sinespaciado"/>
+              <w:jc w:val="center"/>
+              <w:rPr>
+                <w:rFonts w:ascii="Arial" w:hAnsi="Arial" w:cs="Arial"/>
+                <w:lang w:val="es-ES" w:eastAsia="es-EC"/>
+              </w:rPr>
+            </w:pPr>
+            <w:r>
+              <w:rPr>
+                <w:rFonts w:ascii="Arial" w:hAnsi="Arial" w:cs="Arial"/>
+                <w:lang w:val="es-ES" w:eastAsia="es-EC"/>
+              </w:rPr>
+              <w:t xml:space="preserve">Usuario Final / </w:t>
+            </w:r>
+            <w:proofErr w:type="spellStart"/>
+            <w:r>
+              <w:rPr>
+                <w:rFonts w:ascii="Arial" w:hAnsi="Arial" w:cs="Arial"/>
+                <w:lang w:val="es-ES" w:eastAsia="es-EC"/>
+              </w:rPr>
+              <w:t>Admin</w:t>
+            </w:r>
+            <w:proofErr w:type="spellEnd"/>
+          </w:p>
+        </w:tc>
+        <w:tc>
+          <w:tcPr>
+            <w:tcW w:w="0" w:type="auto"/>
+            <w:vAlign w:val="center"/>
+            <w:hideMark/>
+          </w:tcPr>
+          <w:p>
+            <w:pPr>
+              <w:pStyle w:val="Sinespaciado"/>
+              <w:jc w:val="center"/>
+              <w:rPr>
+                <w:rFonts w:ascii="Arial" w:hAnsi="Arial" w:cs="Arial"/>
+                <w:lang w:val="es-ES" w:eastAsia="es-EC"/>
+              </w:rPr>
+            </w:pPr>
+            <w:r>
+              <w:rPr>
+                <w:rFonts w:ascii="Arial" w:hAnsi="Arial" w:cs="Arial"/>
+                <w:lang w:val="es-ES" w:eastAsia="es-EC"/>
+              </w:rPr>
+              <w:t>Alta</w:t>
+            </w:r>
+          </w:p>
+        </w:tc>
+      </w:tr>
+      <w:tr>
+        <w:tc>
+          <w:tcPr>
+            <w:tcW w:w="0" w:type="auto"/>
+            <w:vAlign w:val="center"/>
+            <w:hideMark/>
+          </w:tcPr>
+          <w:p>
+            <w:pPr>
+              <w:pStyle w:val="Sinespaciado"/>
+              <w:jc w:val="center"/>
+              <w:rPr>
+                <w:rFonts w:ascii="Arial" w:hAnsi="Arial" w:cs="Arial"/>
+                <w:lang w:val="es-ES" w:eastAsia="es-EC"/>
+              </w:rPr>
+            </w:pPr>
+            <w:r>
+              <w:rPr>
+                <w:rFonts w:ascii="Arial" w:hAnsi="Arial" w:cs="Arial"/>
+                <w:lang w:val="es-ES" w:eastAsia="es-EC"/>
+              </w:rPr>
+              <w:t>RF-03</w:t>
+            </w:r>
+          </w:p>
+        </w:tc>
+        <w:tc>
+          <w:tcPr>
+            <w:tcW w:w="0" w:type="auto"/>
+            <w:vAlign w:val="center"/>
+            <w:hideMark/>
+          </w:tcPr>
+          <w:p>
+            <w:pPr>
+              <w:pStyle w:val="Sinespaciado"/>
+              <w:jc w:val="center"/>
+              <w:rPr>
+                <w:rFonts w:ascii="Arial" w:hAnsi="Arial" w:cs="Arial"/>
+                <w:lang w:val="es-ES" w:eastAsia="es-EC"/>
+              </w:rPr>
+            </w:pPr>
+            <w:r>
+              <w:rPr>
+                <w:rFonts w:ascii="Arial" w:hAnsi="Arial" w:cs="Arial"/>
+                <w:lang w:val="es-ES" w:eastAsia="es-EC"/>
+              </w:rPr>
+              <w:t>Asignación de Técnico</w:t>
+            </w:r>
+          </w:p>
+        </w:tc>
+        <w:tc>
+          <w:tcPr>
+            <w:tcW w:w="0" w:type="auto"/>
+            <w:vAlign w:val="center"/>
+            <w:hideMark/>
+          </w:tcPr>
+          <w:p>
+            <w:pPr>
+              <w:pStyle w:val="Sinespaciado"/>
+              <w:rPr>
+                <w:rFonts w:ascii="Arial" w:hAnsi="Arial" w:cs="Arial"/>
+                <w:lang w:val="es-ES" w:eastAsia="es-EC"/>
+              </w:rPr>
+            </w:pPr>
+            <w:r>
+              <w:rPr>
+                <w:rFonts w:ascii="Arial" w:hAnsi="Arial" w:cs="Arial"/>
+                <w:lang w:val="es-ES" w:eastAsia="es-EC"/>
+              </w:rPr>
+              <w:t>Asignar técnico especializado según categoría, disponibilidad y carga de trabajo</w:t>
+            </w:r>
+          </w:p>
+        </w:tc>
+        <w:tc>
+          <w:tcPr>
+            <w:tcW w:w="0" w:type="auto"/>
+            <w:vAlign w:val="center"/>
+            <w:hideMark/>
+          </w:tcPr>
+          <w:p>
+            <w:pPr>
+              <w:pStyle w:val="Sinespaciado"/>
+              <w:jc w:val="center"/>
+              <w:rPr>
+                <w:rFonts w:ascii="Arial" w:hAnsi="Arial" w:cs="Arial"/>
+                <w:lang w:val="es-ES" w:eastAsia="es-EC"/>
+              </w:rPr>
+            </w:pPr>
+            <w:r>
+              <w:rPr>
+                <w:rFonts w:ascii="Arial" w:hAnsi="Arial" w:cs="Arial"/>
+                <w:lang w:val="es-ES" w:eastAsia="es-EC"/>
+              </w:rPr>
+              <w:t>Administrador / Sistema</w:t>
+            </w:r>
+          </w:p>
+        </w:tc>
+        <w:tc>
+          <w:tcPr>
+            <w:tcW w:w="0" w:type="auto"/>
+            <w:vAlign w:val="center"/>
+            <w:hideMark/>
+          </w:tcPr>
+          <w:p>
+            <w:pPr>
+              <w:pStyle w:val="Sinespaciado"/>
+              <w:jc w:val="center"/>
+              <w:rPr>
+                <w:rFonts w:ascii="Arial" w:hAnsi="Arial" w:cs="Arial"/>
+                <w:lang w:val="es-ES" w:eastAsia="es-EC"/>
+              </w:rPr>
+            </w:pPr>
+            <w:r>
+              <w:rPr>
+                <w:rFonts w:ascii="Arial" w:hAnsi="Arial" w:cs="Arial"/>
+                <w:lang w:val="es-ES" w:eastAsia="es-EC"/>
+              </w:rPr>
+              <w:t>Alta</w:t>
+            </w:r>
+          </w:p>
+        </w:tc>
+      </w:tr>
+      <w:tr>
+        <w:tc>
+          <w:tcPr>
+            <w:tcW w:w="0" w:type="auto"/>
+            <w:vAlign w:val="center"/>
+            <w:hideMark/>
+          </w:tcPr>
+          <w:p>
+            <w:pPr>
+              <w:pStyle w:val="Sinespaciado"/>
+              <w:jc w:val="center"/>
+              <w:rPr>
+                <w:rFonts w:ascii="Arial" w:hAnsi="Arial" w:cs="Arial"/>
+                <w:lang w:val="es-ES" w:eastAsia="es-EC"/>
+              </w:rPr>
+            </w:pPr>
+            <w:r>
+              <w:rPr>
+                <w:rFonts w:ascii="Arial" w:hAnsi="Arial" w:cs="Arial"/>
+                <w:lang w:val="es-ES" w:eastAsia="es-EC"/>
+              </w:rPr>
+              <w:t>RF-04</w:t>
+            </w:r>
+          </w:p>
+        </w:tc>
+        <w:tc>
+          <w:tcPr>
+            <w:tcW w:w="0" w:type="auto"/>
+            <w:vAlign w:val="center"/>
+            <w:hideMark/>
+          </w:tcPr>
+          <w:p>
+            <w:pPr>
+              <w:pStyle w:val="Sinespaciado"/>
+              <w:jc w:val="center"/>
+              <w:rPr>
+                <w:rFonts w:ascii="Arial" w:hAnsi="Arial" w:cs="Arial"/>
+                <w:lang w:val="es-ES" w:eastAsia="es-EC"/>
+              </w:rPr>
+            </w:pPr>
+            <w:r>
+              <w:rPr>
+                <w:rFonts w:ascii="Arial" w:hAnsi="Arial" w:cs="Arial"/>
+                <w:lang w:val="es-ES" w:eastAsia="es-EC"/>
+              </w:rPr>
+              <w:t xml:space="preserve">Gestión de Estados del </w:t>
+            </w:r>
+            <w:proofErr w:type="gramStart"/>
+            <w:r>
+              <w:rPr>
+                <w:rFonts w:ascii="Arial" w:hAnsi="Arial" w:cs="Arial"/>
+                <w:lang w:val="es-ES" w:eastAsia="es-EC"/>
+              </w:rPr>
+              <w:t>Ticket</w:t>
+            </w:r>
+            <w:proofErr w:type="gramEnd"/>
+          </w:p>
+        </w:tc>
+        <w:tc>
+          <w:tcPr>
+            <w:tcW w:w="0" w:type="auto"/>
+            <w:vAlign w:val="center"/>
+            <w:hideMark/>
+          </w:tcPr>
+          <w:p>
+            <w:pPr>
+              <w:pStyle w:val="Sinespaciado"/>
+              <w:rPr>
+                <w:rFonts w:ascii="Arial" w:hAnsi="Arial" w:cs="Arial"/>
+                <w:lang w:val="es-ES" w:eastAsia="es-EC"/>
+              </w:rPr>
+            </w:pPr>
+            <w:r>
+              <w:rPr>
+                <w:rFonts w:ascii="Arial" w:hAnsi="Arial" w:cs="Arial"/>
+                <w:lang w:val="es-ES" w:eastAsia="es-EC"/>
+              </w:rPr>
+              <w:t>Controlar el ciclo de vida: Abierto → Asignado → En Progreso → Resuelto → Cerrado</w:t>
+            </w:r>
+          </w:p>
+        </w:tc>
+        <w:tc>
+          <w:tcPr>
+            <w:tcW w:w="0" w:type="auto"/>
+            <w:vAlign w:val="center"/>
+            <w:hideMark/>
+          </w:tcPr>
+          <w:p>
+            <w:pPr>
+              <w:pStyle w:val="Sinespaciado"/>
+              <w:jc w:val="center"/>
+              <w:rPr>
+                <w:rFonts w:ascii="Arial" w:hAnsi="Arial" w:cs="Arial"/>
+                <w:lang w:val="es-ES" w:eastAsia="es-EC"/>
+              </w:rPr>
+            </w:pPr>
+            <w:r>
+              <w:rPr>
+                <w:rFonts w:ascii="Arial" w:hAnsi="Arial" w:cs="Arial"/>
+                <w:lang w:val="es-ES" w:eastAsia="es-EC"/>
+              </w:rPr>
+              <w:t>Técnico / Administrador</w:t>
+            </w:r>
+          </w:p>
+        </w:tc>
+        <w:tc>
+          <w:tcPr>
+            <w:tcW w:w="0" w:type="auto"/>
+            <w:vAlign w:val="center"/>
+            <w:hideMark/>
+          </w:tcPr>
+          <w:p>
+            <w:pPr>
+              <w:pStyle w:val="Sinespaciado"/>
+              <w:jc w:val="center"/>
+              <w:rPr>
+                <w:rFonts w:ascii="Arial" w:hAnsi="Arial" w:cs="Arial"/>
+                <w:lang w:val="es-ES" w:eastAsia="es-EC"/>
+              </w:rPr>
+            </w:pPr>
+            <w:r>
+              <w:rPr>
+                <w:rFonts w:ascii="Arial" w:hAnsi="Arial" w:cs="Arial"/>
+                <w:lang w:val="es-ES" w:eastAsia="es-EC"/>
+              </w:rPr>
+              <w:t>Alta</w:t>
+            </w:r>
+          </w:p>
+        </w:tc>
+      </w:tr>
+      <w:tr>
+        <w:tc>
+          <w:tcPr>
+            <w:tcW w:w="0" w:type="auto"/>
+            <w:vAlign w:val="center"/>
+            <w:hideMark/>
+          </w:tcPr>
+          <w:p>
+            <w:pPr>
+              <w:pStyle w:val="Sinespaciado"/>
+              <w:jc w:val="center"/>
+              <w:rPr>
+                <w:rFonts w:ascii="Arial" w:hAnsi="Arial" w:cs="Arial"/>
+                <w:lang w:val="es-ES" w:eastAsia="es-EC"/>
+              </w:rPr>
+            </w:pPr>
+            <w:r>
+              <w:rPr>
+                <w:rFonts w:ascii="Arial" w:hAnsi="Arial" w:cs="Arial"/>
+                <w:lang w:val="es-ES" w:eastAsia="es-EC"/>
+              </w:rPr>
+              <w:t>RF-05</w:t>
+            </w:r>
+          </w:p>
+        </w:tc>
+        <w:tc>
+          <w:tcPr>
+            <w:tcW w:w="0" w:type="auto"/>
+            <w:vAlign w:val="center"/>
+            <w:hideMark/>
+          </w:tcPr>
+          <w:p>
+            <w:pPr>
+              <w:pStyle w:val="Sinespaciado"/>
+              <w:jc w:val="center"/>
+              <w:rPr>
+                <w:rFonts w:ascii="Arial" w:hAnsi="Arial" w:cs="Arial"/>
+                <w:lang w:val="es-ES" w:eastAsia="es-EC"/>
+              </w:rPr>
+            </w:pPr>
+            <w:r>
+              <w:rPr>
+                <w:rFonts w:ascii="Arial" w:hAnsi="Arial" w:cs="Arial"/>
+                <w:lang w:val="es-ES" w:eastAsia="es-EC"/>
+              </w:rPr>
+              <w:t xml:space="preserve">Actualización de </w:t>
+            </w:r>
+            <w:proofErr w:type="gramStart"/>
+            <w:r>
+              <w:rPr>
+                <w:rFonts w:ascii="Arial" w:hAnsi="Arial" w:cs="Arial"/>
+                <w:lang w:val="es-ES" w:eastAsia="es-EC"/>
+              </w:rPr>
+              <w:t>Tickets</w:t>
+            </w:r>
+            <w:proofErr w:type="gramEnd"/>
+          </w:p>
+        </w:tc>
+        <w:tc>
+          <w:tcPr>
+            <w:tcW w:w="0" w:type="auto"/>
+            <w:vAlign w:val="center"/>
+            <w:hideMark/>
+          </w:tcPr>
+          <w:p>
+            <w:pPr>
+              <w:pStyle w:val="Sinespaciado"/>
+              <w:rPr>
+                <w:rFonts w:ascii="Arial" w:hAnsi="Arial" w:cs="Arial"/>
+                <w:lang w:val="es-ES" w:eastAsia="es-EC"/>
+              </w:rPr>
+            </w:pPr>
+            <w:r>
+              <w:rPr>
+                <w:rFonts w:ascii="Arial" w:hAnsi="Arial" w:cs="Arial"/>
+                <w:lang w:val="es-ES" w:eastAsia="es-EC"/>
+              </w:rPr>
+              <w:t>Permitir agregar notas, diagnósticos, soluciones y evidencias durante la resolución</w:t>
+            </w:r>
+          </w:p>
+        </w:tc>
+        <w:tc>
+          <w:tcPr>
+            <w:tcW w:w="0" w:type="auto"/>
+            <w:vAlign w:val="center"/>
+            <w:hideMark/>
+          </w:tcPr>
+          <w:p>
+            <w:pPr>
+              <w:pStyle w:val="Sinespaciado"/>
+              <w:jc w:val="center"/>
+              <w:rPr>
+                <w:rFonts w:ascii="Arial" w:hAnsi="Arial" w:cs="Arial"/>
+                <w:lang w:val="es-ES" w:eastAsia="es-EC"/>
+              </w:rPr>
+            </w:pPr>
+            <w:r>
+              <w:rPr>
+                <w:rFonts w:ascii="Arial" w:hAnsi="Arial" w:cs="Arial"/>
+                <w:lang w:val="es-ES" w:eastAsia="es-EC"/>
+              </w:rPr>
+              <w:t>Técnico</w:t>
+            </w:r>
+          </w:p>
+        </w:tc>
+        <w:tc>
+          <w:tcPr>
+            <w:tcW w:w="0" w:type="auto"/>
+            <w:vAlign w:val="center"/>
+            <w:hideMark/>
+          </w:tcPr>
+          <w:p>
+            <w:pPr>
+              <w:pStyle w:val="Sinespaciado"/>
+              <w:jc w:val="center"/>
+              <w:rPr>
+                <w:rFonts w:ascii="Arial" w:hAnsi="Arial" w:cs="Arial"/>
+                <w:lang w:val="es-ES" w:eastAsia="es-EC"/>
+              </w:rPr>
+            </w:pPr>
+            <w:r>
+              <w:rPr>
+                <w:rFonts w:ascii="Arial" w:hAnsi="Arial" w:cs="Arial"/>
+                <w:lang w:val="es-ES" w:eastAsia="es-EC"/>
+              </w:rPr>
+              <w:t>Alta</w:t>
+            </w:r>
+          </w:p>
+        </w:tc>
+      </w:tr>
+      <w:tr>
+        <w:tc>
+          <w:tcPr>
+            <w:tcW w:w="0" w:type="auto"/>
+            <w:vAlign w:val="center"/>
+            <w:hideMark/>
+          </w:tcPr>
+          <w:p>
+            <w:pPr>
+              <w:pStyle w:val="Sinespaciado"/>
+              <w:jc w:val="center"/>
+              <w:rPr>
+                <w:rFonts w:ascii="Arial" w:hAnsi="Arial" w:cs="Arial"/>
+                <w:lang w:val="es-ES" w:eastAsia="es-EC"/>
+              </w:rPr>
+            </w:pPr>
+            <w:r>
+              <w:rPr>
+                <w:rFonts w:ascii="Arial" w:hAnsi="Arial" w:cs="Arial"/>
+                <w:lang w:val="es-ES" w:eastAsia="es-EC"/>
+              </w:rPr>
+              <w:t>RF-06</w:t>
+            </w:r>
+          </w:p>
+        </w:tc>
+        <w:tc>
+          <w:tcPr>
+            <w:tcW w:w="0" w:type="auto"/>
+            <w:vAlign w:val="center"/>
+            <w:hideMark/>
+          </w:tcPr>
+          <w:p>
+            <w:pPr>
+              <w:pStyle w:val="Sinespaciado"/>
+              <w:jc w:val="center"/>
+              <w:rPr>
+                <w:rFonts w:ascii="Arial" w:hAnsi="Arial" w:cs="Arial"/>
+                <w:lang w:val="es-ES" w:eastAsia="es-EC"/>
+              </w:rPr>
+            </w:pPr>
+            <w:r>
+              <w:rPr>
+                <w:rFonts w:ascii="Arial" w:hAnsi="Arial" w:cs="Arial"/>
+                <w:lang w:val="es-ES" w:eastAsia="es-EC"/>
+              </w:rPr>
+              <w:t>Consulta y Seguimiento</w:t>
+            </w:r>
+          </w:p>
+        </w:tc>
+        <w:tc>
+          <w:tcPr>
+            <w:tcW w:w="0" w:type="auto"/>
+            <w:vAlign w:val="center"/>
+            <w:hideMark/>
+          </w:tcPr>
+          <w:p>
+            <w:pPr>
+              <w:pStyle w:val="Sinespaciado"/>
+              <w:rPr>
+                <w:rFonts w:ascii="Arial" w:hAnsi="Arial" w:cs="Arial"/>
+                <w:lang w:val="es-ES" w:eastAsia="es-EC"/>
+              </w:rPr>
+            </w:pPr>
+            <w:r>
+              <w:rPr>
+                <w:rFonts w:ascii="Arial" w:hAnsi="Arial" w:cs="Arial"/>
+                <w:lang w:val="es-ES" w:eastAsia="es-EC"/>
+              </w:rPr>
+              <w:t xml:space="preserve">Búsqueda y filtrado de </w:t>
+            </w:r>
+            <w:proofErr w:type="gramStart"/>
+            <w:r>
+              <w:rPr>
+                <w:rFonts w:ascii="Arial" w:hAnsi="Arial" w:cs="Arial"/>
+                <w:lang w:val="es-ES" w:eastAsia="es-EC"/>
+              </w:rPr>
+              <w:t>tickets</w:t>
+            </w:r>
+            <w:proofErr w:type="gramEnd"/>
+            <w:r>
+              <w:rPr>
+                <w:rFonts w:ascii="Arial" w:hAnsi="Arial" w:cs="Arial"/>
+                <w:lang w:val="es-ES" w:eastAsia="es-EC"/>
+              </w:rPr>
+              <w:t xml:space="preserve"> por estado, categoría, técnico, fecha, etc.</w:t>
+            </w:r>
+          </w:p>
+        </w:tc>
+        <w:tc>
+          <w:tcPr>
+            <w:tcW w:w="0" w:type="auto"/>
+            <w:vAlign w:val="center"/>
+            <w:hideMark/>
+          </w:tcPr>
+          <w:p>
+            <w:pPr>
+              <w:pStyle w:val="Sinespaciado"/>
+              <w:jc w:val="center"/>
+              <w:rPr>
+                <w:rFonts w:ascii="Arial" w:hAnsi="Arial" w:cs="Arial"/>
+                <w:lang w:val="es-ES" w:eastAsia="es-EC"/>
+              </w:rPr>
+            </w:pPr>
+            <w:r>
+              <w:rPr>
+                <w:rFonts w:ascii="Arial" w:hAnsi="Arial" w:cs="Arial"/>
+                <w:lang w:val="es-ES" w:eastAsia="es-EC"/>
+              </w:rPr>
+              <w:t>Todos los actores</w:t>
+            </w:r>
+          </w:p>
+        </w:tc>
+        <w:tc>
+          <w:tcPr>
+            <w:tcW w:w="0" w:type="auto"/>
+            <w:vAlign w:val="center"/>
+            <w:hideMark/>
+          </w:tcPr>
+          <w:p>
+            <w:pPr>
+              <w:pStyle w:val="Sinespaciado"/>
+              <w:jc w:val="center"/>
+              <w:rPr>
+                <w:rFonts w:ascii="Arial" w:hAnsi="Arial" w:cs="Arial"/>
+                <w:lang w:val="es-ES" w:eastAsia="es-EC"/>
+              </w:rPr>
+            </w:pPr>
+            <w:r>
+              <w:rPr>
+                <w:rFonts w:ascii="Arial" w:hAnsi="Arial" w:cs="Arial"/>
+                <w:lang w:val="es-ES" w:eastAsia="es-EC"/>
+              </w:rPr>
+              <w:t>Alta</w:t>
+            </w:r>
+          </w:p>
+        </w:tc>
+      </w:tr>
+      <w:tr>
+        <w:tc>
+          <w:tcPr>
+            <w:tcW w:w="0" w:type="auto"/>
+            <w:vAlign w:val="center"/>
+            <w:hideMark/>
+          </w:tcPr>
+          <w:p>
+            <w:pPr>
+              <w:pStyle w:val="Sinespaciado"/>
+              <w:jc w:val="center"/>
+              <w:rPr>
+                <w:rFonts w:ascii="Arial" w:hAnsi="Arial" w:cs="Arial"/>
+                <w:lang w:val="es-ES" w:eastAsia="es-EC"/>
+              </w:rPr>
+            </w:pPr>
+            <w:r>
+              <w:rPr>
+                <w:rFonts w:ascii="Arial" w:hAnsi="Arial" w:cs="Arial"/>
+                <w:lang w:val="es-ES" w:eastAsia="es-EC"/>
+              </w:rPr>
+              <w:t>RF-07</w:t>
+            </w:r>
+          </w:p>
+        </w:tc>
+        <w:tc>
+          <w:tcPr>
+            <w:tcW w:w="0" w:type="auto"/>
+            <w:vAlign w:val="center"/>
+            <w:hideMark/>
+          </w:tcPr>
+          <w:p>
+            <w:pPr>
+              <w:pStyle w:val="Sinespaciado"/>
+              <w:jc w:val="center"/>
+              <w:rPr>
+                <w:rFonts w:ascii="Arial" w:hAnsi="Arial" w:cs="Arial"/>
+                <w:lang w:val="es-ES" w:eastAsia="es-EC"/>
+              </w:rPr>
+            </w:pPr>
+            <w:r>
+              <w:rPr>
+                <w:rFonts w:ascii="Arial" w:hAnsi="Arial" w:cs="Arial"/>
+                <w:lang w:val="es-ES" w:eastAsia="es-EC"/>
+              </w:rPr>
+              <w:t>Notificaciones</w:t>
+            </w:r>
+          </w:p>
+        </w:tc>
+        <w:tc>
+          <w:tcPr>
+            <w:tcW w:w="0" w:type="auto"/>
+            <w:vAlign w:val="center"/>
+            <w:hideMark/>
+          </w:tcPr>
+          <w:p>
+            <w:pPr>
+              <w:pStyle w:val="Sinespaciado"/>
+              <w:rPr>
+                <w:rFonts w:ascii="Arial" w:hAnsi="Arial" w:cs="Arial"/>
+                <w:lang w:val="es-ES" w:eastAsia="es-EC"/>
+              </w:rPr>
+            </w:pPr>
+            <w:r>
+              <w:rPr>
+                <w:rFonts w:ascii="Arial" w:hAnsi="Arial" w:cs="Arial"/>
+                <w:lang w:val="es-ES" w:eastAsia="es-EC"/>
+              </w:rPr>
+              <w:t xml:space="preserve">Enviar notificaciones automáticas por cambio de estado o asignación (email y/o </w:t>
+            </w:r>
+            <w:proofErr w:type="spellStart"/>
+            <w:r>
+              <w:rPr>
+                <w:rFonts w:ascii="Arial" w:hAnsi="Arial" w:cs="Arial"/>
+                <w:lang w:val="es-ES" w:eastAsia="es-EC"/>
+              </w:rPr>
+              <w:t>dashboard</w:t>
+            </w:r>
+            <w:proofErr w:type="spellEnd"/>
+            <w:r>
+              <w:rPr>
+                <w:rFonts w:ascii="Arial" w:hAnsi="Arial" w:cs="Arial"/>
+                <w:lang w:val="es-ES" w:eastAsia="es-EC"/>
+              </w:rPr>
+              <w:t>)</w:t>
+            </w:r>
+          </w:p>
+        </w:tc>
+        <w:tc>
+          <w:tcPr>
+            <w:tcW w:w="0" w:type="auto"/>
+            <w:vAlign w:val="center"/>
+            <w:hideMark/>
+          </w:tcPr>
+          <w:p>
+            <w:pPr>
+              <w:pStyle w:val="Sinespaciado"/>
+              <w:jc w:val="center"/>
+              <w:rPr>
+                <w:rFonts w:ascii="Arial" w:hAnsi="Arial" w:cs="Arial"/>
+                <w:lang w:val="es-ES" w:eastAsia="es-EC"/>
+              </w:rPr>
+            </w:pPr>
+            <w:r>
+              <w:rPr>
+                <w:rFonts w:ascii="Arial" w:hAnsi="Arial" w:cs="Arial"/>
+                <w:lang w:val="es-ES" w:eastAsia="es-EC"/>
+              </w:rPr>
+              <w:t>Sistema</w:t>
+            </w:r>
+          </w:p>
+        </w:tc>
+        <w:tc>
+          <w:tcPr>
+            <w:tcW w:w="0" w:type="auto"/>
+            <w:vAlign w:val="center"/>
+            <w:hideMark/>
+          </w:tcPr>
+          <w:p>
+            <w:pPr>
+              <w:pStyle w:val="Sinespaciado"/>
+              <w:jc w:val="center"/>
+              <w:rPr>
+                <w:rFonts w:ascii="Arial" w:hAnsi="Arial" w:cs="Arial"/>
+                <w:lang w:val="es-ES" w:eastAsia="es-EC"/>
+              </w:rPr>
+            </w:pPr>
+            <w:r>
+              <w:rPr>
+                <w:rFonts w:ascii="Arial" w:hAnsi="Arial" w:cs="Arial"/>
+                <w:lang w:val="es-ES" w:eastAsia="es-EC"/>
+              </w:rPr>
+              <w:t>Media</w:t>
+            </w:r>
+          </w:p>
+        </w:tc>
+      </w:tr>
+      <w:tr>
+        <w:tc>
+          <w:tcPr>
+            <w:tcW w:w="0" w:type="auto"/>
+            <w:vAlign w:val="center"/>
+            <w:hideMark/>
+          </w:tcPr>
+          <w:p>
+            <w:pPr>
+              <w:pStyle w:val="Sinespaciado"/>
+              <w:jc w:val="center"/>
+              <w:rPr>
+                <w:rFonts w:ascii="Arial" w:hAnsi="Arial" w:cs="Arial"/>
+                <w:lang w:val="es-ES" w:eastAsia="es-EC"/>
+              </w:rPr>
+            </w:pPr>
+            <w:r>
+              <w:rPr>
+                <w:rFonts w:ascii="Arial" w:hAnsi="Arial" w:cs="Arial"/>
+                <w:lang w:val="es-ES" w:eastAsia="es-EC"/>
+              </w:rPr>
+              <w:t>RF-08</w:t>
+            </w:r>
+          </w:p>
+        </w:tc>
+        <w:tc>
+          <w:tcPr>
+            <w:tcW w:w="0" w:type="auto"/>
+            <w:vAlign w:val="center"/>
+            <w:hideMark/>
+          </w:tcPr>
+          <w:p>
+            <w:pPr>
+              <w:pStyle w:val="Sinespaciado"/>
+              <w:jc w:val="center"/>
+              <w:rPr>
+                <w:rFonts w:ascii="Arial" w:hAnsi="Arial" w:cs="Arial"/>
+                <w:lang w:val="es-ES" w:eastAsia="es-EC"/>
+              </w:rPr>
+            </w:pPr>
+            <w:r>
+              <w:rPr>
+                <w:rFonts w:ascii="Arial" w:hAnsi="Arial" w:cs="Arial"/>
+                <w:lang w:val="es-ES" w:eastAsia="es-EC"/>
+              </w:rPr>
+              <w:t>Gestión de Técnicos</w:t>
+            </w:r>
+          </w:p>
+        </w:tc>
+        <w:tc>
+          <w:tcPr>
+            <w:tcW w:w="0" w:type="auto"/>
+            <w:vAlign w:val="center"/>
+            <w:hideMark/>
+          </w:tcPr>
+          <w:p>
+            <w:pPr>
+              <w:pStyle w:val="Sinespaciado"/>
+              <w:rPr>
+                <w:rFonts w:ascii="Arial" w:hAnsi="Arial" w:cs="Arial"/>
+                <w:lang w:val="es-ES" w:eastAsia="es-EC"/>
+              </w:rPr>
+            </w:pPr>
+            <w:r>
+              <w:rPr>
+                <w:rFonts w:ascii="Arial" w:hAnsi="Arial" w:cs="Arial"/>
+                <w:lang w:val="es-ES" w:eastAsia="es-EC"/>
+              </w:rPr>
+              <w:t>Registrar técnicos con sus especialidades y disponibilidad</w:t>
+            </w:r>
+          </w:p>
+        </w:tc>
+        <w:tc>
+          <w:tcPr>
+            <w:tcW w:w="0" w:type="auto"/>
+            <w:vAlign w:val="center"/>
+            <w:hideMark/>
+          </w:tcPr>
+          <w:p>
+            <w:pPr>
+              <w:pStyle w:val="Sinespaciado"/>
+              <w:jc w:val="center"/>
+              <w:rPr>
+                <w:rFonts w:ascii="Arial" w:hAnsi="Arial" w:cs="Arial"/>
+                <w:lang w:val="es-ES" w:eastAsia="es-EC"/>
+              </w:rPr>
+            </w:pPr>
+            <w:r>
+              <w:rPr>
+                <w:rFonts w:ascii="Arial" w:hAnsi="Arial" w:cs="Arial"/>
+                <w:lang w:val="es-ES" w:eastAsia="es-EC"/>
+              </w:rPr>
+              <w:t>Administrador</w:t>
+            </w:r>
+          </w:p>
+        </w:tc>
+        <w:tc>
+          <w:tcPr>
+            <w:tcW w:w="0" w:type="auto"/>
+            <w:vAlign w:val="center"/>
+            <w:hideMark/>
+          </w:tcPr>
+          <w:p>
+            <w:pPr>
+              <w:pStyle w:val="Sinespaciado"/>
+              <w:jc w:val="center"/>
+              <w:rPr>
+                <w:rFonts w:ascii="Arial" w:hAnsi="Arial" w:cs="Arial"/>
+                <w:lang w:val="es-ES" w:eastAsia="es-EC"/>
+              </w:rPr>
+            </w:pPr>
+            <w:r>
+              <w:rPr>
+                <w:rFonts w:ascii="Arial" w:hAnsi="Arial" w:cs="Arial"/>
+                <w:lang w:val="es-ES" w:eastAsia="es-EC"/>
+              </w:rPr>
+              <w:t>Media</w:t>
+            </w:r>
+          </w:p>
+        </w:tc>
+      </w:tr>
+      <w:tr>
+        <w:tc>
+          <w:tcPr>
+            <w:tcW w:w="0" w:type="auto"/>
+            <w:vAlign w:val="center"/>
+            <w:hideMark/>
+          </w:tcPr>
+          <w:p>
+            <w:pPr>
+              <w:pStyle w:val="Sinespaciado"/>
+              <w:jc w:val="center"/>
+              <w:rPr>
+                <w:rFonts w:ascii="Arial" w:hAnsi="Arial" w:cs="Arial"/>
+                <w:lang w:val="es-ES" w:eastAsia="es-EC"/>
+              </w:rPr>
+            </w:pPr>
+            <w:r>
+              <w:rPr>
+                <w:rFonts w:ascii="Arial" w:hAnsi="Arial" w:cs="Arial"/>
+                <w:lang w:val="es-ES" w:eastAsia="es-EC"/>
+              </w:rPr>
+              <w:t>RF-09</w:t>
+            </w:r>
+          </w:p>
+        </w:tc>
+        <w:tc>
+          <w:tcPr>
+            <w:tcW w:w="0" w:type="auto"/>
+            <w:vAlign w:val="center"/>
+            <w:hideMark/>
+          </w:tcPr>
+          <w:p>
+            <w:pPr>
+              <w:pStyle w:val="Sinespaciado"/>
+              <w:jc w:val="center"/>
+              <w:rPr>
+                <w:rFonts w:ascii="Arial" w:hAnsi="Arial" w:cs="Arial"/>
+                <w:lang w:val="es-ES" w:eastAsia="es-EC"/>
+              </w:rPr>
+            </w:pPr>
+            <w:r>
+              <w:rPr>
+                <w:rFonts w:ascii="Arial" w:hAnsi="Arial" w:cs="Arial"/>
+                <w:lang w:val="es-ES" w:eastAsia="es-EC"/>
+              </w:rPr>
+              <w:t>Reportes y Métricas</w:t>
+            </w:r>
+          </w:p>
+        </w:tc>
+        <w:tc>
+          <w:tcPr>
+            <w:tcW w:w="0" w:type="auto"/>
+            <w:vAlign w:val="center"/>
+            <w:hideMark/>
+          </w:tcPr>
+          <w:p>
+            <w:pPr>
+              <w:pStyle w:val="Sinespaciado"/>
+              <w:rPr>
+                <w:rFonts w:ascii="Arial" w:hAnsi="Arial" w:cs="Arial"/>
+                <w:lang w:val="es-ES" w:eastAsia="es-EC"/>
+              </w:rPr>
+            </w:pPr>
+            <w:r>
+              <w:rPr>
+                <w:rFonts w:ascii="Arial" w:hAnsi="Arial" w:cs="Arial"/>
+                <w:lang w:val="es-ES" w:eastAsia="es-EC"/>
+              </w:rPr>
+              <w:t xml:space="preserve">Generar reportes de tiempo de resolución, </w:t>
+            </w:r>
+            <w:proofErr w:type="gramStart"/>
+            <w:r>
+              <w:rPr>
+                <w:rFonts w:ascii="Arial" w:hAnsi="Arial" w:cs="Arial"/>
+                <w:lang w:val="es-ES" w:eastAsia="es-EC"/>
+              </w:rPr>
+              <w:t>tickets</w:t>
+            </w:r>
+            <w:proofErr w:type="gramEnd"/>
+            <w:r>
+              <w:rPr>
+                <w:rFonts w:ascii="Arial" w:hAnsi="Arial" w:cs="Arial"/>
+                <w:lang w:val="es-ES" w:eastAsia="es-EC"/>
+              </w:rPr>
+              <w:t xml:space="preserve"> por categoría, SLA, etc.</w:t>
+            </w:r>
+          </w:p>
+        </w:tc>
+        <w:tc>
+          <w:tcPr>
+            <w:tcW w:w="0" w:type="auto"/>
+            <w:vAlign w:val="center"/>
+            <w:hideMark/>
+          </w:tcPr>
+          <w:p>
+            <w:pPr>
+              <w:pStyle w:val="Sinespaciado"/>
+              <w:jc w:val="center"/>
+              <w:rPr>
+                <w:rFonts w:ascii="Arial" w:hAnsi="Arial" w:cs="Arial"/>
+                <w:lang w:val="es-ES" w:eastAsia="es-EC"/>
+              </w:rPr>
+            </w:pPr>
+            <w:r>
+              <w:rPr>
+                <w:rFonts w:ascii="Arial" w:hAnsi="Arial" w:cs="Arial"/>
+                <w:lang w:val="es-ES" w:eastAsia="es-EC"/>
+              </w:rPr>
+              <w:t>Administrador</w:t>
+            </w:r>
+          </w:p>
+        </w:tc>
+        <w:tc>
+          <w:tcPr>
+            <w:tcW w:w="0" w:type="auto"/>
+            <w:vAlign w:val="center"/>
+            <w:hideMark/>
+          </w:tcPr>
+          <w:p>
+            <w:pPr>
+              <w:pStyle w:val="Sinespaciado"/>
+              <w:jc w:val="center"/>
+              <w:rPr>
+                <w:rFonts w:ascii="Arial" w:hAnsi="Arial" w:cs="Arial"/>
+                <w:lang w:val="es-ES" w:eastAsia="es-EC"/>
+              </w:rPr>
+            </w:pPr>
+            <w:r>
+              <w:rPr>
+                <w:rFonts w:ascii="Arial" w:hAnsi="Arial" w:cs="Arial"/>
+                <w:lang w:val="es-ES" w:eastAsia="es-EC"/>
+              </w:rPr>
+              <w:t>Media</w:t>
+            </w:r>
+          </w:p>
+        </w:tc>
+      </w:tr>
+      <w:tr>
+        <w:tc>
+          <w:tcPr>
+            <w:tcW w:w="0" w:type="auto"/>
+            <w:vAlign w:val="center"/>
+            <w:hideMark/>
+          </w:tcPr>
+          <w:p>
+            <w:pPr>
+              <w:pStyle w:val="Sinespaciado"/>
+              <w:jc w:val="center"/>
+              <w:rPr>
+                <w:rFonts w:ascii="Arial" w:hAnsi="Arial" w:cs="Arial"/>
+                <w:lang w:val="es-ES" w:eastAsia="es-EC"/>
+              </w:rPr>
+            </w:pPr>
+            <w:r>
+              <w:rPr>
+                <w:rFonts w:ascii="Arial" w:hAnsi="Arial" w:cs="Arial"/>
+                <w:lang w:val="es-ES" w:eastAsia="es-EC"/>
+              </w:rPr>
+              <w:t>RF-10</w:t>
+            </w:r>
+          </w:p>
+        </w:tc>
+        <w:tc>
+          <w:tcPr>
+            <w:tcW w:w="0" w:type="auto"/>
+            <w:vAlign w:val="center"/>
+            <w:hideMark/>
+          </w:tcPr>
+          <w:p>
+            <w:pPr>
+              <w:pStyle w:val="Sinespaciado"/>
+              <w:jc w:val="center"/>
+              <w:rPr>
+                <w:rFonts w:ascii="Arial" w:hAnsi="Arial" w:cs="Arial"/>
+                <w:lang w:val="es-ES" w:eastAsia="es-EC"/>
+              </w:rPr>
+            </w:pPr>
+            <w:r>
+              <w:rPr>
+                <w:rFonts w:ascii="Arial" w:hAnsi="Arial" w:cs="Arial"/>
+                <w:lang w:val="es-ES" w:eastAsia="es-EC"/>
+              </w:rPr>
+              <w:t>Historial y Auditoría</w:t>
+            </w:r>
+          </w:p>
+        </w:tc>
+        <w:tc>
+          <w:tcPr>
+            <w:tcW w:w="0" w:type="auto"/>
+            <w:vAlign w:val="center"/>
+            <w:hideMark/>
+          </w:tcPr>
+          <w:p>
+            <w:pPr>
+              <w:pStyle w:val="Sinespaciado"/>
+              <w:rPr>
+                <w:rFonts w:ascii="Arial" w:hAnsi="Arial" w:cs="Arial"/>
+                <w:lang w:val="es-ES" w:eastAsia="es-EC"/>
+              </w:rPr>
+            </w:pPr>
+            <w:r>
+              <w:rPr>
+                <w:rFonts w:ascii="Arial" w:hAnsi="Arial" w:cs="Arial"/>
+                <w:lang w:val="es-ES" w:eastAsia="es-EC"/>
+              </w:rPr>
+              <w:t xml:space="preserve">Registrar todas las acciones realizadas en cada </w:t>
+            </w:r>
+            <w:proofErr w:type="gramStart"/>
+            <w:r>
+              <w:rPr>
+                <w:rFonts w:ascii="Arial" w:hAnsi="Arial" w:cs="Arial"/>
+                <w:lang w:val="es-ES" w:eastAsia="es-EC"/>
+              </w:rPr>
+              <w:t>ticket</w:t>
+            </w:r>
+            <w:proofErr w:type="gramEnd"/>
+            <w:r>
+              <w:rPr>
+                <w:rFonts w:ascii="Arial" w:hAnsi="Arial" w:cs="Arial"/>
+                <w:lang w:val="es-ES" w:eastAsia="es-EC"/>
+              </w:rPr>
+              <w:t xml:space="preserve"> (trazabilidad)</w:t>
+            </w:r>
+          </w:p>
+        </w:tc>
+        <w:tc>
+          <w:tcPr>
+            <w:tcW w:w="0" w:type="auto"/>
+            <w:vAlign w:val="center"/>
+            <w:hideMark/>
+          </w:tcPr>
+          <w:p>
+            <w:pPr>
+              <w:pStyle w:val="Sinespaciado"/>
+              <w:jc w:val="center"/>
+              <w:rPr>
+                <w:rFonts w:ascii="Arial" w:hAnsi="Arial" w:cs="Arial"/>
+                <w:lang w:val="es-ES" w:eastAsia="es-EC"/>
+              </w:rPr>
+            </w:pPr>
+            <w:r>
+              <w:rPr>
+                <w:rFonts w:ascii="Arial" w:hAnsi="Arial" w:cs="Arial"/>
+                <w:lang w:val="es-ES" w:eastAsia="es-EC"/>
+              </w:rPr>
+              <w:t>Administrador</w:t>
+            </w:r>
+          </w:p>
+        </w:tc>
+        <w:tc>
+          <w:tcPr>
+            <w:tcW w:w="0" w:type="auto"/>
+            <w:vAlign w:val="center"/>
+            <w:hideMark/>
+          </w:tcPr>
+          <w:p>
+            <w:pPr>
+              <w:pStyle w:val="Sinespaciado"/>
+              <w:jc w:val="center"/>
+              <w:rPr>
+                <w:rFonts w:ascii="Arial" w:hAnsi="Arial" w:cs="Arial"/>
+                <w:lang w:val="es-ES" w:eastAsia="es-EC"/>
+              </w:rPr>
+            </w:pPr>
+            <w:r>
+              <w:rPr>
+                <w:rFonts w:ascii="Arial" w:hAnsi="Arial" w:cs="Arial"/>
+                <w:lang w:val="es-ES" w:eastAsia="es-EC"/>
+              </w:rPr>
+              <w:t>Alta</w:t>
+            </w:r>
+          </w:p>
+        </w:tc>
+      </w:tr>
+    </w:tbl>
     <w:p>
       <w:pPr>
         <w:pStyle w:val="Sinespaciado"/>
@@ -6004,7 +7524,6 @@
   <w:style w:type="character" w:default="1" w:styleId="Fuentedeprrafopredeter">
     <w:name w:val="Default Paragraph Font"/>
     <w:uiPriority w:val="1"/>
-    <w:semiHidden/>
     <w:unhideWhenUsed/>
   </w:style>
   <w:style w:type="table" w:default="1" w:styleId="Tablanormal">

</xml_diff>

<commit_message>
docs: agregar requerimientos no funcionales (escalabilidad, mantenibilidad, trazabilidad)
</commit_message>
<xml_diff>
--- a/Actividad_1/analisis/Analisis_Incidentes.docx
+++ b/Actividad_1/analisis/Analisis_Incidentes.docx
@@ -1875,15 +1875,71 @@
         <w:tblLook w:val="04A0" w:firstRow="1" w:lastRow="0" w:firstColumn="1" w:lastColumn="0" w:noHBand="0" w:noVBand="1"/>
       </w:tblPr>
       <w:tblGrid>
-        <w:gridCol w:w="620"/>
-        <w:gridCol w:w="1963"/>
-        <w:gridCol w:w="3009"/>
-        <w:gridCol w:w="1720"/>
+        <w:gridCol w:w="1129"/>
+        <w:gridCol w:w="1757"/>
+        <w:gridCol w:w="2741"/>
+        <w:gridCol w:w="1685"/>
         <w:gridCol w:w="1182"/>
       </w:tblGrid>
       <w:tr>
         <w:tc>
           <w:tcPr>
+            <w:tcW w:w="1129" w:type="dxa"/>
+            <w:vAlign w:val="center"/>
+            <w:hideMark/>
+          </w:tcPr>
+          <w:p>
+            <w:pPr>
+              <w:pStyle w:val="Sinespaciado"/>
+              <w:jc w:val="center"/>
+              <w:rPr>
+                <w:rFonts w:ascii="Arial" w:hAnsi="Arial" w:cs="Arial"/>
+                <w:b/>
+                <w:bCs/>
+                <w:lang w:val="es-ES" w:eastAsia="es-EC"/>
+              </w:rPr>
+            </w:pPr>
+            <w:r>
+              <w:rPr>
+                <w:rFonts w:ascii="Arial" w:hAnsi="Arial" w:cs="Arial"/>
+                <w:b/>
+                <w:bCs/>
+                <w:lang w:val="es-ES" w:eastAsia="es-EC"/>
+              </w:rPr>
+              <w:t>ID</w:t>
+            </w:r>
+          </w:p>
+        </w:tc>
+        <w:tc>
+          <w:tcPr>
+            <w:tcW w:w="1454" w:type="dxa"/>
+            <w:vAlign w:val="center"/>
+            <w:hideMark/>
+          </w:tcPr>
+          <w:p>
+            <w:pPr>
+              <w:pStyle w:val="Sinespaciado"/>
+              <w:jc w:val="center"/>
+              <w:rPr>
+                <w:rFonts w:ascii="Arial" w:hAnsi="Arial" w:cs="Arial"/>
+                <w:b/>
+                <w:bCs/>
+                <w:lang w:val="es-ES" w:eastAsia="es-EC"/>
+              </w:rPr>
+            </w:pPr>
+            <w:r>
+              <w:rPr>
+                <w:rFonts w:ascii="Arial" w:hAnsi="Arial" w:cs="Arial"/>
+                <w:b/>
+                <w:bCs/>
+                <w:lang w:val="es-ES" w:eastAsia="es-EC"/>
+              </w:rPr>
+              <w:t>Requerimiento Funcional</w:t>
+            </w:r>
+          </w:p>
+        </w:tc>
+        <w:tc>
+          <w:tcPr>
             <w:tcW w:w="0" w:type="auto"/>
             <w:vAlign w:val="center"/>
             <w:hideMark/>
@@ -1906,7 +1962,7 @@
                 <w:bCs/>
                 <w:lang w:val="es-ES" w:eastAsia="es-EC"/>
               </w:rPr>
-              <w:t>ID</w:t>
+              <w:t>Descripción</w:t>
             </w:r>
           </w:p>
         </w:tc>
@@ -1934,7 +1990,7 @@
                 <w:bCs/>
                 <w:lang w:val="es-ES" w:eastAsia="es-EC"/>
               </w:rPr>
-              <w:t>Requerimiento Funcional</w:t>
+              <w:t>Actor Principal</w:t>
             </w:r>
           </w:p>
         </w:tc>
@@ -1962,7 +2018,57 @@
                 <w:bCs/>
                 <w:lang w:val="es-ES" w:eastAsia="es-EC"/>
               </w:rPr>
-              <w:t>Descripción</w:t>
+              <w:t>Prioridad</w:t>
+            </w:r>
+          </w:p>
+        </w:tc>
+      </w:tr>
+      <w:tr>
+        <w:tc>
+          <w:tcPr>
+            <w:tcW w:w="1129" w:type="dxa"/>
+            <w:vAlign w:val="center"/>
+            <w:hideMark/>
+          </w:tcPr>
+          <w:p>
+            <w:pPr>
+              <w:pStyle w:val="Sinespaciado"/>
+              <w:jc w:val="center"/>
+              <w:rPr>
+                <w:rFonts w:ascii="Arial" w:hAnsi="Arial" w:cs="Arial"/>
+                <w:lang w:val="es-ES" w:eastAsia="es-EC"/>
+              </w:rPr>
+            </w:pPr>
+            <w:r>
+              <w:rPr>
+                <w:rFonts w:ascii="Arial" w:hAnsi="Arial" w:cs="Arial"/>
+                <w:lang w:val="es-ES" w:eastAsia="es-EC"/>
+              </w:rPr>
+              <w:t>RF-01</w:t>
+            </w:r>
+          </w:p>
+        </w:tc>
+        <w:tc>
+          <w:tcPr>
+            <w:tcW w:w="1454" w:type="dxa"/>
+            <w:vAlign w:val="center"/>
+            <w:hideMark/>
+          </w:tcPr>
+          <w:p>
+            <w:pPr>
+              <w:pStyle w:val="Sinespaciado"/>
+              <w:jc w:val="center"/>
+              <w:rPr>
+                <w:rFonts w:ascii="Arial" w:hAnsi="Arial" w:cs="Arial"/>
+                <w:lang w:val="es-ES" w:eastAsia="es-EC"/>
+              </w:rPr>
+            </w:pPr>
+            <w:r>
+              <w:rPr>
+                <w:rFonts w:ascii="Arial" w:hAnsi="Arial" w:cs="Arial"/>
+                <w:lang w:val="es-ES" w:eastAsia="es-EC"/>
+              </w:rPr>
+              <w:t>Registro de Incidentes</w:t>
             </w:r>
           </w:p>
         </w:tc>
@@ -1975,22 +2081,41 @@
           <w:p>
             <w:pPr>
               <w:pStyle w:val="Sinespaciado"/>
-              <w:jc w:val="center"/>
-              <w:rPr>
-                <w:rFonts w:ascii="Arial" w:hAnsi="Arial" w:cs="Arial"/>
-                <w:b/>
-                <w:bCs/>
-                <w:lang w:val="es-ES" w:eastAsia="es-EC"/>
-              </w:rPr>
-            </w:pPr>
-            <w:r>
-              <w:rPr>
-                <w:rFonts w:ascii="Arial" w:hAnsi="Arial" w:cs="Arial"/>
-                <w:b/>
-                <w:bCs/>
-                <w:lang w:val="es-ES" w:eastAsia="es-EC"/>
-              </w:rPr>
-              <w:t>Actor Principal</w:t>
+              <w:rPr>
+                <w:rFonts w:ascii="Arial" w:hAnsi="Arial" w:cs="Arial"/>
+                <w:lang w:val="es-ES" w:eastAsia="es-EC"/>
+              </w:rPr>
+            </w:pPr>
+            <w:r>
+              <w:rPr>
+                <w:rFonts w:ascii="Arial" w:hAnsi="Arial" w:cs="Arial"/>
+                <w:lang w:val="es-ES" w:eastAsia="es-EC"/>
+              </w:rPr>
+              <w:t xml:space="preserve">Permitir la creación de </w:t>
+            </w:r>
+            <w:proofErr w:type="gramStart"/>
+            <w:r>
+              <w:rPr>
+                <w:rFonts w:ascii="Arial" w:hAnsi="Arial" w:cs="Arial"/>
+                <w:lang w:val="es-ES" w:eastAsia="es-EC"/>
+              </w:rPr>
+              <w:t>tickets</w:t>
+            </w:r>
+            <w:proofErr w:type="gramEnd"/>
+            <w:r>
+              <w:rPr>
+                <w:rFonts w:ascii="Arial" w:hAnsi="Arial" w:cs="Arial"/>
+                <w:lang w:val="es-ES" w:eastAsia="es-EC"/>
+              </w:rPr>
+              <w:t xml:space="preserve"> con título, </w:t>
+            </w:r>
+            <w:r>
+              <w:rPr>
+                <w:rFonts w:ascii="Arial" w:hAnsi="Arial" w:cs="Arial"/>
+                <w:lang w:val="es-ES" w:eastAsia="es-EC"/>
+              </w:rPr>
+              <w:lastRenderedPageBreak/>
+              <w:t>descripción detallada y evidencia (capturas)</w:t>
             </w:r>
           </w:p>
         </w:tc>
@@ -2006,19 +2131,40 @@
               <w:jc w:val="center"/>
               <w:rPr>
                 <w:rFonts w:ascii="Arial" w:hAnsi="Arial" w:cs="Arial"/>
-                <w:b/>
-                <w:bCs/>
-                <w:lang w:val="es-ES" w:eastAsia="es-EC"/>
-              </w:rPr>
-            </w:pPr>
-            <w:r>
-              <w:rPr>
-                <w:rFonts w:ascii="Arial" w:hAnsi="Arial" w:cs="Arial"/>
-                <w:b/>
-                <w:bCs/>
-                <w:lang w:val="es-ES" w:eastAsia="es-EC"/>
-              </w:rPr>
-              <w:t>Prioridad</w:t>
+                <w:lang w:val="es-ES" w:eastAsia="es-EC"/>
+              </w:rPr>
+            </w:pPr>
+            <w:r>
+              <w:rPr>
+                <w:rFonts w:ascii="Arial" w:hAnsi="Arial" w:cs="Arial"/>
+                <w:lang w:val="es-ES" w:eastAsia="es-EC"/>
+              </w:rPr>
+              <w:lastRenderedPageBreak/>
+              <w:t>Usuario Final</w:t>
+            </w:r>
+          </w:p>
+        </w:tc>
+        <w:tc>
+          <w:tcPr>
+            <w:tcW w:w="0" w:type="auto"/>
+            <w:vAlign w:val="center"/>
+            <w:hideMark/>
+          </w:tcPr>
+          <w:p>
+            <w:pPr>
+              <w:pStyle w:val="Sinespaciado"/>
+              <w:jc w:val="center"/>
+              <w:rPr>
+                <w:rFonts w:ascii="Arial" w:hAnsi="Arial" w:cs="Arial"/>
+                <w:lang w:val="es-ES" w:eastAsia="es-EC"/>
+              </w:rPr>
+            </w:pPr>
+            <w:r>
+              <w:rPr>
+                <w:rFonts w:ascii="Arial" w:hAnsi="Arial" w:cs="Arial"/>
+                <w:lang w:val="es-ES" w:eastAsia="es-EC"/>
+              </w:rPr>
+              <w:t>Alta</w:t>
             </w:r>
           </w:p>
         </w:tc>
@@ -2026,6 +2172,54 @@
       <w:tr>
         <w:tc>
           <w:tcPr>
+            <w:tcW w:w="1129" w:type="dxa"/>
+            <w:vAlign w:val="center"/>
+            <w:hideMark/>
+          </w:tcPr>
+          <w:p>
+            <w:pPr>
+              <w:pStyle w:val="Sinespaciado"/>
+              <w:jc w:val="center"/>
+              <w:rPr>
+                <w:rFonts w:ascii="Arial" w:hAnsi="Arial" w:cs="Arial"/>
+                <w:lang w:val="es-ES" w:eastAsia="es-EC"/>
+              </w:rPr>
+            </w:pPr>
+            <w:r>
+              <w:rPr>
+                <w:rFonts w:ascii="Arial" w:hAnsi="Arial" w:cs="Arial"/>
+                <w:lang w:val="es-ES" w:eastAsia="es-EC"/>
+              </w:rPr>
+              <w:t>RF-02</w:t>
+            </w:r>
+          </w:p>
+        </w:tc>
+        <w:tc>
+          <w:tcPr>
+            <w:tcW w:w="1454" w:type="dxa"/>
+            <w:vAlign w:val="center"/>
+            <w:hideMark/>
+          </w:tcPr>
+          <w:p>
+            <w:pPr>
+              <w:pStyle w:val="Sinespaciado"/>
+              <w:jc w:val="center"/>
+              <w:rPr>
+                <w:rFonts w:ascii="Arial" w:hAnsi="Arial" w:cs="Arial"/>
+                <w:lang w:val="es-ES" w:eastAsia="es-EC"/>
+              </w:rPr>
+            </w:pPr>
+            <w:r>
+              <w:rPr>
+                <w:rFonts w:ascii="Arial" w:hAnsi="Arial" w:cs="Arial"/>
+                <w:lang w:val="es-ES" w:eastAsia="es-EC"/>
+              </w:rPr>
+              <w:t>Categorización de Fallos</w:t>
+            </w:r>
+          </w:p>
+        </w:tc>
+        <w:tc>
+          <w:tcPr>
             <w:tcW w:w="0" w:type="auto"/>
             <w:vAlign w:val="center"/>
             <w:hideMark/>
@@ -2033,18 +2227,33 @@
           <w:p>
             <w:pPr>
               <w:pStyle w:val="Sinespaciado"/>
-              <w:jc w:val="center"/>
-              <w:rPr>
-                <w:rFonts w:ascii="Arial" w:hAnsi="Arial" w:cs="Arial"/>
-                <w:lang w:val="es-ES" w:eastAsia="es-EC"/>
-              </w:rPr>
-            </w:pPr>
-            <w:r>
-              <w:rPr>
-                <w:rFonts w:ascii="Arial" w:hAnsi="Arial" w:cs="Arial"/>
-                <w:lang w:val="es-ES" w:eastAsia="es-EC"/>
-              </w:rPr>
-              <w:t>RF-01</w:t>
+              <w:rPr>
+                <w:rFonts w:ascii="Arial" w:hAnsi="Arial" w:cs="Arial"/>
+                <w:lang w:val="es-ES" w:eastAsia="es-EC"/>
+              </w:rPr>
+            </w:pPr>
+            <w:r>
+              <w:rPr>
+                <w:rFonts w:ascii="Arial" w:hAnsi="Arial" w:cs="Arial"/>
+                <w:lang w:val="es-ES" w:eastAsia="es-EC"/>
+              </w:rPr>
+              <w:t xml:space="preserve">Clasificar </w:t>
+            </w:r>
+            <w:proofErr w:type="gramStart"/>
+            <w:r>
+              <w:rPr>
+                <w:rFonts w:ascii="Arial" w:hAnsi="Arial" w:cs="Arial"/>
+                <w:lang w:val="es-ES" w:eastAsia="es-EC"/>
+              </w:rPr>
+              <w:t>automáticamente o manualmente</w:t>
+            </w:r>
+            <w:proofErr w:type="gramEnd"/>
+            <w:r>
+              <w:rPr>
+                <w:rFonts w:ascii="Arial" w:hAnsi="Arial" w:cs="Arial"/>
+                <w:lang w:val="es-ES" w:eastAsia="es-EC"/>
+              </w:rPr>
+              <w:t xml:space="preserve"> el incidente en: Hardware, Red, Software u Otros</w:t>
             </w:r>
           </w:p>
         </w:tc>
@@ -2068,8 +2277,17 @@
                 <w:rFonts w:ascii="Arial" w:hAnsi="Arial" w:cs="Arial"/>
                 <w:lang w:val="es-ES" w:eastAsia="es-EC"/>
               </w:rPr>
-              <w:t>Registro de Incidentes</w:t>
-            </w:r>
+              <w:t xml:space="preserve">Usuario Final / </w:t>
+            </w:r>
+            <w:proofErr w:type="spellStart"/>
+            <w:r>
+              <w:rPr>
+                <w:rFonts w:ascii="Arial" w:hAnsi="Arial" w:cs="Arial"/>
+                <w:lang w:val="es-ES" w:eastAsia="es-EC"/>
+              </w:rPr>
+              <w:t>Admin</w:t>
+            </w:r>
+            <w:proofErr w:type="spellEnd"/>
           </w:p>
         </w:tc>
         <w:tc>
@@ -2081,41 +2299,68 @@
           <w:p>
             <w:pPr>
               <w:pStyle w:val="Sinespaciado"/>
-              <w:rPr>
-                <w:rFonts w:ascii="Arial" w:hAnsi="Arial" w:cs="Arial"/>
-                <w:lang w:val="es-ES" w:eastAsia="es-EC"/>
-              </w:rPr>
-            </w:pPr>
-            <w:r>
-              <w:rPr>
-                <w:rFonts w:ascii="Arial" w:hAnsi="Arial" w:cs="Arial"/>
-                <w:lang w:val="es-ES" w:eastAsia="es-EC"/>
-              </w:rPr>
-              <w:t xml:space="preserve">Permitir la creación de </w:t>
-            </w:r>
-            <w:proofErr w:type="gramStart"/>
-            <w:r>
-              <w:rPr>
-                <w:rFonts w:ascii="Arial" w:hAnsi="Arial" w:cs="Arial"/>
-                <w:lang w:val="es-ES" w:eastAsia="es-EC"/>
-              </w:rPr>
-              <w:t>tickets</w:t>
-            </w:r>
-            <w:proofErr w:type="gramEnd"/>
-            <w:r>
-              <w:rPr>
-                <w:rFonts w:ascii="Arial" w:hAnsi="Arial" w:cs="Arial"/>
-                <w:lang w:val="es-ES" w:eastAsia="es-EC"/>
-              </w:rPr>
-              <w:t xml:space="preserve"> con título, </w:t>
-            </w:r>
-            <w:r>
-              <w:rPr>
-                <w:rFonts w:ascii="Arial" w:hAnsi="Arial" w:cs="Arial"/>
-                <w:lang w:val="es-ES" w:eastAsia="es-EC"/>
-              </w:rPr>
-              <w:lastRenderedPageBreak/>
-              <w:t>descripción detallada y evidencia (capturas)</w:t>
+              <w:jc w:val="center"/>
+              <w:rPr>
+                <w:rFonts w:ascii="Arial" w:hAnsi="Arial" w:cs="Arial"/>
+                <w:lang w:val="es-ES" w:eastAsia="es-EC"/>
+              </w:rPr>
+            </w:pPr>
+            <w:r>
+              <w:rPr>
+                <w:rFonts w:ascii="Arial" w:hAnsi="Arial" w:cs="Arial"/>
+                <w:lang w:val="es-ES" w:eastAsia="es-EC"/>
+              </w:rPr>
+              <w:t>Alta</w:t>
+            </w:r>
+          </w:p>
+        </w:tc>
+      </w:tr>
+      <w:tr>
+        <w:tc>
+          <w:tcPr>
+            <w:tcW w:w="1129" w:type="dxa"/>
+            <w:vAlign w:val="center"/>
+            <w:hideMark/>
+          </w:tcPr>
+          <w:p>
+            <w:pPr>
+              <w:pStyle w:val="Sinespaciado"/>
+              <w:jc w:val="center"/>
+              <w:rPr>
+                <w:rFonts w:ascii="Arial" w:hAnsi="Arial" w:cs="Arial"/>
+                <w:lang w:val="es-ES" w:eastAsia="es-EC"/>
+              </w:rPr>
+            </w:pPr>
+            <w:r>
+              <w:rPr>
+                <w:rFonts w:ascii="Arial" w:hAnsi="Arial" w:cs="Arial"/>
+                <w:lang w:val="es-ES" w:eastAsia="es-EC"/>
+              </w:rPr>
+              <w:t>RF-03</w:t>
+            </w:r>
+          </w:p>
+        </w:tc>
+        <w:tc>
+          <w:tcPr>
+            <w:tcW w:w="1454" w:type="dxa"/>
+            <w:vAlign w:val="center"/>
+            <w:hideMark/>
+          </w:tcPr>
+          <w:p>
+            <w:pPr>
+              <w:pStyle w:val="Sinespaciado"/>
+              <w:jc w:val="center"/>
+              <w:rPr>
+                <w:rFonts w:ascii="Arial" w:hAnsi="Arial" w:cs="Arial"/>
+                <w:lang w:val="es-ES" w:eastAsia="es-EC"/>
+              </w:rPr>
+            </w:pPr>
+            <w:r>
+              <w:rPr>
+                <w:rFonts w:ascii="Arial" w:hAnsi="Arial" w:cs="Arial"/>
+                <w:lang w:val="es-ES" w:eastAsia="es-EC"/>
+              </w:rPr>
+              <w:t>Asignación de Técnico</w:t>
             </w:r>
           </w:p>
         </w:tc>
@@ -2128,19 +2373,17 @@
           <w:p>
             <w:pPr>
               <w:pStyle w:val="Sinespaciado"/>
-              <w:jc w:val="center"/>
-              <w:rPr>
-                <w:rFonts w:ascii="Arial" w:hAnsi="Arial" w:cs="Arial"/>
-                <w:lang w:val="es-ES" w:eastAsia="es-EC"/>
-              </w:rPr>
-            </w:pPr>
-            <w:r>
-              <w:rPr>
-                <w:rFonts w:ascii="Arial" w:hAnsi="Arial" w:cs="Arial"/>
-                <w:lang w:val="es-ES" w:eastAsia="es-EC"/>
-              </w:rPr>
-              <w:lastRenderedPageBreak/>
-              <w:t>Usuario Final</w:t>
+              <w:rPr>
+                <w:rFonts w:ascii="Arial" w:hAnsi="Arial" w:cs="Arial"/>
+                <w:lang w:val="es-ES" w:eastAsia="es-EC"/>
+              </w:rPr>
+            </w:pPr>
+            <w:r>
+              <w:rPr>
+                <w:rFonts w:ascii="Arial" w:hAnsi="Arial" w:cs="Arial"/>
+                <w:lang w:val="es-ES" w:eastAsia="es-EC"/>
+              </w:rPr>
+              <w:t>Asignar técnico especializado según categoría, disponibilidad y carga de trabajo</w:t>
             </w:r>
           </w:p>
         </w:tc>
@@ -2164,6 +2407,30 @@
                 <w:rFonts w:ascii="Arial" w:hAnsi="Arial" w:cs="Arial"/>
                 <w:lang w:val="es-ES" w:eastAsia="es-EC"/>
               </w:rPr>
+              <w:t>Administrador / Sistema</w:t>
+            </w:r>
+          </w:p>
+        </w:tc>
+        <w:tc>
+          <w:tcPr>
+            <w:tcW w:w="0" w:type="auto"/>
+            <w:vAlign w:val="center"/>
+            <w:hideMark/>
+          </w:tcPr>
+          <w:p>
+            <w:pPr>
+              <w:pStyle w:val="Sinespaciado"/>
+              <w:jc w:val="center"/>
+              <w:rPr>
+                <w:rFonts w:ascii="Arial" w:hAnsi="Arial" w:cs="Arial"/>
+                <w:lang w:val="es-ES" w:eastAsia="es-EC"/>
+              </w:rPr>
+            </w:pPr>
+            <w:r>
+              <w:rPr>
+                <w:rFonts w:ascii="Arial" w:hAnsi="Arial" w:cs="Arial"/>
+                <w:lang w:val="es-ES" w:eastAsia="es-EC"/>
+              </w:rPr>
               <w:t>Alta</w:t>
             </w:r>
           </w:p>
@@ -2172,6 +2439,63 @@
       <w:tr>
         <w:tc>
           <w:tcPr>
+            <w:tcW w:w="1129" w:type="dxa"/>
+            <w:vAlign w:val="center"/>
+            <w:hideMark/>
+          </w:tcPr>
+          <w:p>
+            <w:pPr>
+              <w:pStyle w:val="Sinespaciado"/>
+              <w:jc w:val="center"/>
+              <w:rPr>
+                <w:rFonts w:ascii="Arial" w:hAnsi="Arial" w:cs="Arial"/>
+                <w:lang w:val="es-ES" w:eastAsia="es-EC"/>
+              </w:rPr>
+            </w:pPr>
+            <w:r>
+              <w:rPr>
+                <w:rFonts w:ascii="Arial" w:hAnsi="Arial" w:cs="Arial"/>
+                <w:lang w:val="es-ES" w:eastAsia="es-EC"/>
+              </w:rPr>
+              <w:t>RF-04</w:t>
+            </w:r>
+          </w:p>
+        </w:tc>
+        <w:tc>
+          <w:tcPr>
+            <w:tcW w:w="1454" w:type="dxa"/>
+            <w:vAlign w:val="center"/>
+            <w:hideMark/>
+          </w:tcPr>
+          <w:p>
+            <w:pPr>
+              <w:pStyle w:val="Sinespaciado"/>
+              <w:jc w:val="center"/>
+              <w:rPr>
+                <w:rFonts w:ascii="Arial" w:hAnsi="Arial" w:cs="Arial"/>
+                <w:lang w:val="es-ES" w:eastAsia="es-EC"/>
+              </w:rPr>
+            </w:pPr>
+            <w:r>
+              <w:rPr>
+                <w:rFonts w:ascii="Arial" w:hAnsi="Arial" w:cs="Arial"/>
+                <w:lang w:val="es-ES" w:eastAsia="es-EC"/>
+              </w:rPr>
+              <w:t xml:space="preserve">Gestión de Estados del </w:t>
+            </w:r>
+            <w:proofErr w:type="gramStart"/>
+            <w:r>
+              <w:rPr>
+                <w:rFonts w:ascii="Arial" w:hAnsi="Arial" w:cs="Arial"/>
+                <w:lang w:val="es-ES" w:eastAsia="es-EC"/>
+              </w:rPr>
+              <w:t>Ticket</w:t>
+            </w:r>
+            <w:proofErr w:type="gramEnd"/>
+          </w:p>
+        </w:tc>
+        <w:tc>
+          <w:tcPr>
             <w:tcW w:w="0" w:type="auto"/>
             <w:vAlign w:val="center"/>
             <w:hideMark/>
@@ -2179,18 +2503,17 @@
           <w:p>
             <w:pPr>
               <w:pStyle w:val="Sinespaciado"/>
-              <w:jc w:val="center"/>
-              <w:rPr>
-                <w:rFonts w:ascii="Arial" w:hAnsi="Arial" w:cs="Arial"/>
-                <w:lang w:val="es-ES" w:eastAsia="es-EC"/>
-              </w:rPr>
-            </w:pPr>
-            <w:r>
-              <w:rPr>
-                <w:rFonts w:ascii="Arial" w:hAnsi="Arial" w:cs="Arial"/>
-                <w:lang w:val="es-ES" w:eastAsia="es-EC"/>
-              </w:rPr>
-              <w:t>RF-02</w:t>
+              <w:rPr>
+                <w:rFonts w:ascii="Arial" w:hAnsi="Arial" w:cs="Arial"/>
+                <w:lang w:val="es-ES" w:eastAsia="es-EC"/>
+              </w:rPr>
+            </w:pPr>
+            <w:r>
+              <w:rPr>
+                <w:rFonts w:ascii="Arial" w:hAnsi="Arial" w:cs="Arial"/>
+                <w:lang w:val="es-ES" w:eastAsia="es-EC"/>
+              </w:rPr>
+              <w:t>Controlar el ciclo de vida: Abierto → Asignado → En Progreso → Resuelto → Cerrado</w:t>
             </w:r>
           </w:p>
         </w:tc>
@@ -2214,7 +2537,7 @@
                 <w:rFonts w:ascii="Arial" w:hAnsi="Arial" w:cs="Arial"/>
                 <w:lang w:val="es-ES" w:eastAsia="es-EC"/>
               </w:rPr>
-              <w:t>Categorización de Fallos</w:t>
+              <w:t>Técnico / Administrador</w:t>
             </w:r>
           </w:p>
         </w:tc>
@@ -2227,17 +2550,68 @@
           <w:p>
             <w:pPr>
               <w:pStyle w:val="Sinespaciado"/>
-              <w:rPr>
-                <w:rFonts w:ascii="Arial" w:hAnsi="Arial" w:cs="Arial"/>
-                <w:lang w:val="es-ES" w:eastAsia="es-EC"/>
-              </w:rPr>
-            </w:pPr>
-            <w:r>
-              <w:rPr>
-                <w:rFonts w:ascii="Arial" w:hAnsi="Arial" w:cs="Arial"/>
-                <w:lang w:val="es-ES" w:eastAsia="es-EC"/>
-              </w:rPr>
-              <w:t xml:space="preserve">Clasificar </w:t>
+              <w:jc w:val="center"/>
+              <w:rPr>
+                <w:rFonts w:ascii="Arial" w:hAnsi="Arial" w:cs="Arial"/>
+                <w:lang w:val="es-ES" w:eastAsia="es-EC"/>
+              </w:rPr>
+            </w:pPr>
+            <w:r>
+              <w:rPr>
+                <w:rFonts w:ascii="Arial" w:hAnsi="Arial" w:cs="Arial"/>
+                <w:lang w:val="es-ES" w:eastAsia="es-EC"/>
+              </w:rPr>
+              <w:t>Alta</w:t>
+            </w:r>
+          </w:p>
+        </w:tc>
+      </w:tr>
+      <w:tr>
+        <w:tc>
+          <w:tcPr>
+            <w:tcW w:w="1129" w:type="dxa"/>
+            <w:vAlign w:val="center"/>
+            <w:hideMark/>
+          </w:tcPr>
+          <w:p>
+            <w:pPr>
+              <w:pStyle w:val="Sinespaciado"/>
+              <w:jc w:val="center"/>
+              <w:rPr>
+                <w:rFonts w:ascii="Arial" w:hAnsi="Arial" w:cs="Arial"/>
+                <w:lang w:val="es-ES" w:eastAsia="es-EC"/>
+              </w:rPr>
+            </w:pPr>
+            <w:r>
+              <w:rPr>
+                <w:rFonts w:ascii="Arial" w:hAnsi="Arial" w:cs="Arial"/>
+                <w:lang w:val="es-ES" w:eastAsia="es-EC"/>
+              </w:rPr>
+              <w:t>RF-05</w:t>
+            </w:r>
+          </w:p>
+        </w:tc>
+        <w:tc>
+          <w:tcPr>
+            <w:tcW w:w="1454" w:type="dxa"/>
+            <w:vAlign w:val="center"/>
+            <w:hideMark/>
+          </w:tcPr>
+          <w:p>
+            <w:pPr>
+              <w:pStyle w:val="Sinespaciado"/>
+              <w:jc w:val="center"/>
+              <w:rPr>
+                <w:rFonts w:ascii="Arial" w:hAnsi="Arial" w:cs="Arial"/>
+                <w:lang w:val="es-ES" w:eastAsia="es-EC"/>
+              </w:rPr>
+            </w:pPr>
+            <w:r>
+              <w:rPr>
+                <w:rFonts w:ascii="Arial" w:hAnsi="Arial" w:cs="Arial"/>
+                <w:lang w:val="es-ES" w:eastAsia="es-EC"/>
+              </w:rPr>
+              <w:t xml:space="preserve">Actualización de </w:t>
             </w:r>
             <w:proofErr w:type="gramStart"/>
             <w:r>
@@ -2245,16 +2619,9 @@
                 <w:rFonts w:ascii="Arial" w:hAnsi="Arial" w:cs="Arial"/>
                 <w:lang w:val="es-ES" w:eastAsia="es-EC"/>
               </w:rPr>
-              <w:t>automáticamente o manualmente</w:t>
+              <w:t>Tickets</w:t>
             </w:r>
             <w:proofErr w:type="gramEnd"/>
-            <w:r>
-              <w:rPr>
-                <w:rFonts w:ascii="Arial" w:hAnsi="Arial" w:cs="Arial"/>
-                <w:lang w:val="es-ES" w:eastAsia="es-EC"/>
-              </w:rPr>
-              <w:t xml:space="preserve"> el incidente en: Hardware, Red, Software u Otros</w:t>
-            </w:r>
           </w:p>
         </w:tc>
         <w:tc>
@@ -2266,28 +2633,18 @@
           <w:p>
             <w:pPr>
               <w:pStyle w:val="Sinespaciado"/>
-              <w:jc w:val="center"/>
-              <w:rPr>
-                <w:rFonts w:ascii="Arial" w:hAnsi="Arial" w:cs="Arial"/>
-                <w:lang w:val="es-ES" w:eastAsia="es-EC"/>
-              </w:rPr>
-            </w:pPr>
-            <w:r>
-              <w:rPr>
-                <w:rFonts w:ascii="Arial" w:hAnsi="Arial" w:cs="Arial"/>
-                <w:lang w:val="es-ES" w:eastAsia="es-EC"/>
-              </w:rPr>
-              <w:t xml:space="preserve">Usuario Final / </w:t>
-            </w:r>
-            <w:proofErr w:type="spellStart"/>
-            <w:r>
-              <w:rPr>
-                <w:rFonts w:ascii="Arial" w:hAnsi="Arial" w:cs="Arial"/>
-                <w:lang w:val="es-ES" w:eastAsia="es-EC"/>
-              </w:rPr>
-              <w:t>Admin</w:t>
-            </w:r>
-            <w:proofErr w:type="spellEnd"/>
+              <w:rPr>
+                <w:rFonts w:ascii="Arial" w:hAnsi="Arial" w:cs="Arial"/>
+                <w:lang w:val="es-ES" w:eastAsia="es-EC"/>
+              </w:rPr>
+            </w:pPr>
+            <w:r>
+              <w:rPr>
+                <w:rFonts w:ascii="Arial" w:hAnsi="Arial" w:cs="Arial"/>
+                <w:lang w:val="es-ES" w:eastAsia="es-EC"/>
+              </w:rPr>
+              <w:t>Permitir agregar notas, diagnósticos, soluciones y evidencias durante la resolución</w:t>
+            </w:r>
           </w:p>
         </w:tc>
         <w:tc>
@@ -2310,6 +2667,30 @@
                 <w:rFonts w:ascii="Arial" w:hAnsi="Arial" w:cs="Arial"/>
                 <w:lang w:val="es-ES" w:eastAsia="es-EC"/>
               </w:rPr>
+              <w:t>Técnico</w:t>
+            </w:r>
+          </w:p>
+        </w:tc>
+        <w:tc>
+          <w:tcPr>
+            <w:tcW w:w="0" w:type="auto"/>
+            <w:vAlign w:val="center"/>
+            <w:hideMark/>
+          </w:tcPr>
+          <w:p>
+            <w:pPr>
+              <w:pStyle w:val="Sinespaciado"/>
+              <w:jc w:val="center"/>
+              <w:rPr>
+                <w:rFonts w:ascii="Arial" w:hAnsi="Arial" w:cs="Arial"/>
+                <w:lang w:val="es-ES" w:eastAsia="es-EC"/>
+              </w:rPr>
+            </w:pPr>
+            <w:r>
+              <w:rPr>
+                <w:rFonts w:ascii="Arial" w:hAnsi="Arial" w:cs="Arial"/>
+                <w:lang w:val="es-ES" w:eastAsia="es-EC"/>
+              </w:rPr>
               <w:t>Alta</w:t>
             </w:r>
           </w:p>
@@ -2318,6 +2699,54 @@
       <w:tr>
         <w:tc>
           <w:tcPr>
+            <w:tcW w:w="1129" w:type="dxa"/>
+            <w:vAlign w:val="center"/>
+            <w:hideMark/>
+          </w:tcPr>
+          <w:p>
+            <w:pPr>
+              <w:pStyle w:val="Sinespaciado"/>
+              <w:jc w:val="center"/>
+              <w:rPr>
+                <w:rFonts w:ascii="Arial" w:hAnsi="Arial" w:cs="Arial"/>
+                <w:lang w:val="es-ES" w:eastAsia="es-EC"/>
+              </w:rPr>
+            </w:pPr>
+            <w:r>
+              <w:rPr>
+                <w:rFonts w:ascii="Arial" w:hAnsi="Arial" w:cs="Arial"/>
+                <w:lang w:val="es-ES" w:eastAsia="es-EC"/>
+              </w:rPr>
+              <w:t>RF-06</w:t>
+            </w:r>
+          </w:p>
+        </w:tc>
+        <w:tc>
+          <w:tcPr>
+            <w:tcW w:w="1454" w:type="dxa"/>
+            <w:vAlign w:val="center"/>
+            <w:hideMark/>
+          </w:tcPr>
+          <w:p>
+            <w:pPr>
+              <w:pStyle w:val="Sinespaciado"/>
+              <w:jc w:val="center"/>
+              <w:rPr>
+                <w:rFonts w:ascii="Arial" w:hAnsi="Arial" w:cs="Arial"/>
+                <w:lang w:val="es-ES" w:eastAsia="es-EC"/>
+              </w:rPr>
+            </w:pPr>
+            <w:r>
+              <w:rPr>
+                <w:rFonts w:ascii="Arial" w:hAnsi="Arial" w:cs="Arial"/>
+                <w:lang w:val="es-ES" w:eastAsia="es-EC"/>
+              </w:rPr>
+              <w:t>Consulta y Seguimiento</w:t>
+            </w:r>
+          </w:p>
+        </w:tc>
+        <w:tc>
+          <w:tcPr>
             <w:tcW w:w="0" w:type="auto"/>
             <w:vAlign w:val="center"/>
             <w:hideMark/>
@@ -2325,18 +2754,33 @@
           <w:p>
             <w:pPr>
               <w:pStyle w:val="Sinespaciado"/>
-              <w:jc w:val="center"/>
-              <w:rPr>
-                <w:rFonts w:ascii="Arial" w:hAnsi="Arial" w:cs="Arial"/>
-                <w:lang w:val="es-ES" w:eastAsia="es-EC"/>
-              </w:rPr>
-            </w:pPr>
-            <w:r>
-              <w:rPr>
-                <w:rFonts w:ascii="Arial" w:hAnsi="Arial" w:cs="Arial"/>
-                <w:lang w:val="es-ES" w:eastAsia="es-EC"/>
-              </w:rPr>
-              <w:t>RF-03</w:t>
+              <w:rPr>
+                <w:rFonts w:ascii="Arial" w:hAnsi="Arial" w:cs="Arial"/>
+                <w:lang w:val="es-ES" w:eastAsia="es-EC"/>
+              </w:rPr>
+            </w:pPr>
+            <w:r>
+              <w:rPr>
+                <w:rFonts w:ascii="Arial" w:hAnsi="Arial" w:cs="Arial"/>
+                <w:lang w:val="es-ES" w:eastAsia="es-EC"/>
+              </w:rPr>
+              <w:t xml:space="preserve">Búsqueda y filtrado de </w:t>
+            </w:r>
+            <w:proofErr w:type="gramStart"/>
+            <w:r>
+              <w:rPr>
+                <w:rFonts w:ascii="Arial" w:hAnsi="Arial" w:cs="Arial"/>
+                <w:lang w:val="es-ES" w:eastAsia="es-EC"/>
+              </w:rPr>
+              <w:t>tickets</w:t>
+            </w:r>
+            <w:proofErr w:type="gramEnd"/>
+            <w:r>
+              <w:rPr>
+                <w:rFonts w:ascii="Arial" w:hAnsi="Arial" w:cs="Arial"/>
+                <w:lang w:val="es-ES" w:eastAsia="es-EC"/>
+              </w:rPr>
+              <w:t xml:space="preserve"> por estado, categoría, técnico, fecha, etc.</w:t>
             </w:r>
           </w:p>
         </w:tc>
@@ -2360,7 +2804,7 @@
                 <w:rFonts w:ascii="Arial" w:hAnsi="Arial" w:cs="Arial"/>
                 <w:lang w:val="es-ES" w:eastAsia="es-EC"/>
               </w:rPr>
-              <w:t>Asignación de Técnico</w:t>
+              <w:t>Todos los actores</w:t>
             </w:r>
           </w:p>
         </w:tc>
@@ -2373,17 +2817,68 @@
           <w:p>
             <w:pPr>
               <w:pStyle w:val="Sinespaciado"/>
-              <w:rPr>
-                <w:rFonts w:ascii="Arial" w:hAnsi="Arial" w:cs="Arial"/>
-                <w:lang w:val="es-ES" w:eastAsia="es-EC"/>
-              </w:rPr>
-            </w:pPr>
-            <w:r>
-              <w:rPr>
-                <w:rFonts w:ascii="Arial" w:hAnsi="Arial" w:cs="Arial"/>
-                <w:lang w:val="es-ES" w:eastAsia="es-EC"/>
-              </w:rPr>
-              <w:t>Asignar técnico especializado según categoría, disponibilidad y carga de trabajo</w:t>
+              <w:jc w:val="center"/>
+              <w:rPr>
+                <w:rFonts w:ascii="Arial" w:hAnsi="Arial" w:cs="Arial"/>
+                <w:lang w:val="es-ES" w:eastAsia="es-EC"/>
+              </w:rPr>
+            </w:pPr>
+            <w:r>
+              <w:rPr>
+                <w:rFonts w:ascii="Arial" w:hAnsi="Arial" w:cs="Arial"/>
+                <w:lang w:val="es-ES" w:eastAsia="es-EC"/>
+              </w:rPr>
+              <w:t>Alta</w:t>
+            </w:r>
+          </w:p>
+        </w:tc>
+      </w:tr>
+      <w:tr>
+        <w:tc>
+          <w:tcPr>
+            <w:tcW w:w="1129" w:type="dxa"/>
+            <w:vAlign w:val="center"/>
+            <w:hideMark/>
+          </w:tcPr>
+          <w:p>
+            <w:pPr>
+              <w:pStyle w:val="Sinespaciado"/>
+              <w:jc w:val="center"/>
+              <w:rPr>
+                <w:rFonts w:ascii="Arial" w:hAnsi="Arial" w:cs="Arial"/>
+                <w:lang w:val="es-ES" w:eastAsia="es-EC"/>
+              </w:rPr>
+            </w:pPr>
+            <w:r>
+              <w:rPr>
+                <w:rFonts w:ascii="Arial" w:hAnsi="Arial" w:cs="Arial"/>
+                <w:lang w:val="es-ES" w:eastAsia="es-EC"/>
+              </w:rPr>
+              <w:t>RF-07</w:t>
+            </w:r>
+          </w:p>
+        </w:tc>
+        <w:tc>
+          <w:tcPr>
+            <w:tcW w:w="1454" w:type="dxa"/>
+            <w:vAlign w:val="center"/>
+            <w:hideMark/>
+          </w:tcPr>
+          <w:p>
+            <w:pPr>
+              <w:pStyle w:val="Sinespaciado"/>
+              <w:jc w:val="center"/>
+              <w:rPr>
+                <w:rFonts w:ascii="Arial" w:hAnsi="Arial" w:cs="Arial"/>
+                <w:lang w:val="es-ES" w:eastAsia="es-EC"/>
+              </w:rPr>
+            </w:pPr>
+            <w:r>
+              <w:rPr>
+                <w:rFonts w:ascii="Arial" w:hAnsi="Arial" w:cs="Arial"/>
+                <w:lang w:val="es-ES" w:eastAsia="es-EC"/>
+              </w:rPr>
+              <w:t>Notificaciones</w:t>
             </w:r>
           </w:p>
         </w:tc>
@@ -2396,18 +2891,33 @@
           <w:p>
             <w:pPr>
               <w:pStyle w:val="Sinespaciado"/>
-              <w:jc w:val="center"/>
-              <w:rPr>
-                <w:rFonts w:ascii="Arial" w:hAnsi="Arial" w:cs="Arial"/>
-                <w:lang w:val="es-ES" w:eastAsia="es-EC"/>
-              </w:rPr>
-            </w:pPr>
-            <w:r>
-              <w:rPr>
-                <w:rFonts w:ascii="Arial" w:hAnsi="Arial" w:cs="Arial"/>
-                <w:lang w:val="es-ES" w:eastAsia="es-EC"/>
-              </w:rPr>
-              <w:t>Administrador / Sistema</w:t>
+              <w:rPr>
+                <w:rFonts w:ascii="Arial" w:hAnsi="Arial" w:cs="Arial"/>
+                <w:lang w:val="es-ES" w:eastAsia="es-EC"/>
+              </w:rPr>
+            </w:pPr>
+            <w:r>
+              <w:rPr>
+                <w:rFonts w:ascii="Arial" w:hAnsi="Arial" w:cs="Arial"/>
+                <w:lang w:val="es-ES" w:eastAsia="es-EC"/>
+              </w:rPr>
+              <w:t xml:space="preserve">Enviar notificaciones automáticas por cambio de estado o asignación (email y/o </w:t>
+            </w:r>
+            <w:proofErr w:type="spellStart"/>
+            <w:r>
+              <w:rPr>
+                <w:rFonts w:ascii="Arial" w:hAnsi="Arial" w:cs="Arial"/>
+                <w:lang w:val="es-ES" w:eastAsia="es-EC"/>
+              </w:rPr>
+              <w:t>dashboard</w:t>
+            </w:r>
+            <w:proofErr w:type="spellEnd"/>
+            <w:r>
+              <w:rPr>
+                <w:rFonts w:ascii="Arial" w:hAnsi="Arial" w:cs="Arial"/>
+                <w:lang w:val="es-ES" w:eastAsia="es-EC"/>
+              </w:rPr>
+              <w:t>)</w:t>
             </w:r>
           </w:p>
         </w:tc>
@@ -2431,7 +2941,31 @@
                 <w:rFonts w:ascii="Arial" w:hAnsi="Arial" w:cs="Arial"/>
                 <w:lang w:val="es-ES" w:eastAsia="es-EC"/>
               </w:rPr>
-              <w:t>Alta</w:t>
+              <w:t>Sistema</w:t>
+            </w:r>
+          </w:p>
+        </w:tc>
+        <w:tc>
+          <w:tcPr>
+            <w:tcW w:w="0" w:type="auto"/>
+            <w:vAlign w:val="center"/>
+            <w:hideMark/>
+          </w:tcPr>
+          <w:p>
+            <w:pPr>
+              <w:pStyle w:val="Sinespaciado"/>
+              <w:jc w:val="center"/>
+              <w:rPr>
+                <w:rFonts w:ascii="Arial" w:hAnsi="Arial" w:cs="Arial"/>
+                <w:lang w:val="es-ES" w:eastAsia="es-EC"/>
+              </w:rPr>
+            </w:pPr>
+            <w:r>
+              <w:rPr>
+                <w:rFonts w:ascii="Arial" w:hAnsi="Arial" w:cs="Arial"/>
+                <w:lang w:val="es-ES" w:eastAsia="es-EC"/>
+              </w:rPr>
+              <w:t>Media</w:t>
             </w:r>
           </w:p>
         </w:tc>
@@ -2439,6 +2973,54 @@
       <w:tr>
         <w:tc>
           <w:tcPr>
+            <w:tcW w:w="1129" w:type="dxa"/>
+            <w:vAlign w:val="center"/>
+            <w:hideMark/>
+          </w:tcPr>
+          <w:p>
+            <w:pPr>
+              <w:pStyle w:val="Sinespaciado"/>
+              <w:jc w:val="center"/>
+              <w:rPr>
+                <w:rFonts w:ascii="Arial" w:hAnsi="Arial" w:cs="Arial"/>
+                <w:lang w:val="es-ES" w:eastAsia="es-EC"/>
+              </w:rPr>
+            </w:pPr>
+            <w:r>
+              <w:rPr>
+                <w:rFonts w:ascii="Arial" w:hAnsi="Arial" w:cs="Arial"/>
+                <w:lang w:val="es-ES" w:eastAsia="es-EC"/>
+              </w:rPr>
+              <w:t>RF-08</w:t>
+            </w:r>
+          </w:p>
+        </w:tc>
+        <w:tc>
+          <w:tcPr>
+            <w:tcW w:w="1454" w:type="dxa"/>
+            <w:vAlign w:val="center"/>
+            <w:hideMark/>
+          </w:tcPr>
+          <w:p>
+            <w:pPr>
+              <w:pStyle w:val="Sinespaciado"/>
+              <w:jc w:val="center"/>
+              <w:rPr>
+                <w:rFonts w:ascii="Arial" w:hAnsi="Arial" w:cs="Arial"/>
+                <w:lang w:val="es-ES" w:eastAsia="es-EC"/>
+              </w:rPr>
+            </w:pPr>
+            <w:r>
+              <w:rPr>
+                <w:rFonts w:ascii="Arial" w:hAnsi="Arial" w:cs="Arial"/>
+                <w:lang w:val="es-ES" w:eastAsia="es-EC"/>
+              </w:rPr>
+              <w:t>Gestión de Técnicos</w:t>
+            </w:r>
+          </w:p>
+        </w:tc>
+        <w:tc>
+          <w:tcPr>
             <w:tcW w:w="0" w:type="auto"/>
             <w:vAlign w:val="center"/>
             <w:hideMark/>
@@ -2446,18 +3028,17 @@
           <w:p>
             <w:pPr>
               <w:pStyle w:val="Sinespaciado"/>
-              <w:jc w:val="center"/>
-              <w:rPr>
-                <w:rFonts w:ascii="Arial" w:hAnsi="Arial" w:cs="Arial"/>
-                <w:lang w:val="es-ES" w:eastAsia="es-EC"/>
-              </w:rPr>
-            </w:pPr>
-            <w:r>
-              <w:rPr>
-                <w:rFonts w:ascii="Arial" w:hAnsi="Arial" w:cs="Arial"/>
-                <w:lang w:val="es-ES" w:eastAsia="es-EC"/>
-              </w:rPr>
-              <w:t>RF-04</w:t>
+              <w:rPr>
+                <w:rFonts w:ascii="Arial" w:hAnsi="Arial" w:cs="Arial"/>
+                <w:lang w:val="es-ES" w:eastAsia="es-EC"/>
+              </w:rPr>
+            </w:pPr>
+            <w:r>
+              <w:rPr>
+                <w:rFonts w:ascii="Arial" w:hAnsi="Arial" w:cs="Arial"/>
+                <w:lang w:val="es-ES" w:eastAsia="es-EC"/>
+              </w:rPr>
+              <w:t>Registrar técnicos con sus especialidades y disponibilidad</w:t>
             </w:r>
           </w:p>
         </w:tc>
@@ -2481,17 +3062,8 @@
                 <w:rFonts w:ascii="Arial" w:hAnsi="Arial" w:cs="Arial"/>
                 <w:lang w:val="es-ES" w:eastAsia="es-EC"/>
               </w:rPr>
-              <w:t xml:space="preserve">Gestión de Estados del </w:t>
-            </w:r>
-            <w:proofErr w:type="gramStart"/>
-            <w:r>
-              <w:rPr>
-                <w:rFonts w:ascii="Arial" w:hAnsi="Arial" w:cs="Arial"/>
-                <w:lang w:val="es-ES" w:eastAsia="es-EC"/>
-              </w:rPr>
-              <w:t>Ticket</w:t>
-            </w:r>
-            <w:proofErr w:type="gramEnd"/>
+              <w:t>Administrador</w:t>
+            </w:r>
           </w:p>
         </w:tc>
         <w:tc>
@@ -2503,17 +3075,68 @@
           <w:p>
             <w:pPr>
               <w:pStyle w:val="Sinespaciado"/>
-              <w:rPr>
-                <w:rFonts w:ascii="Arial" w:hAnsi="Arial" w:cs="Arial"/>
-                <w:lang w:val="es-ES" w:eastAsia="es-EC"/>
-              </w:rPr>
-            </w:pPr>
-            <w:r>
-              <w:rPr>
-                <w:rFonts w:ascii="Arial" w:hAnsi="Arial" w:cs="Arial"/>
-                <w:lang w:val="es-ES" w:eastAsia="es-EC"/>
-              </w:rPr>
-              <w:t>Controlar el ciclo de vida: Abierto → Asignado → En Progreso → Resuelto → Cerrado</w:t>
+              <w:jc w:val="center"/>
+              <w:rPr>
+                <w:rFonts w:ascii="Arial" w:hAnsi="Arial" w:cs="Arial"/>
+                <w:lang w:val="es-ES" w:eastAsia="es-EC"/>
+              </w:rPr>
+            </w:pPr>
+            <w:r>
+              <w:rPr>
+                <w:rFonts w:ascii="Arial" w:hAnsi="Arial" w:cs="Arial"/>
+                <w:lang w:val="es-ES" w:eastAsia="es-EC"/>
+              </w:rPr>
+              <w:t>Media</w:t>
+            </w:r>
+          </w:p>
+        </w:tc>
+      </w:tr>
+      <w:tr>
+        <w:tc>
+          <w:tcPr>
+            <w:tcW w:w="1129" w:type="dxa"/>
+            <w:vAlign w:val="center"/>
+            <w:hideMark/>
+          </w:tcPr>
+          <w:p>
+            <w:pPr>
+              <w:pStyle w:val="Sinespaciado"/>
+              <w:jc w:val="center"/>
+              <w:rPr>
+                <w:rFonts w:ascii="Arial" w:hAnsi="Arial" w:cs="Arial"/>
+                <w:lang w:val="es-ES" w:eastAsia="es-EC"/>
+              </w:rPr>
+            </w:pPr>
+            <w:r>
+              <w:rPr>
+                <w:rFonts w:ascii="Arial" w:hAnsi="Arial" w:cs="Arial"/>
+                <w:lang w:val="es-ES" w:eastAsia="es-EC"/>
+              </w:rPr>
+              <w:t>RF-09</w:t>
+            </w:r>
+          </w:p>
+        </w:tc>
+        <w:tc>
+          <w:tcPr>
+            <w:tcW w:w="1454" w:type="dxa"/>
+            <w:vAlign w:val="center"/>
+            <w:hideMark/>
+          </w:tcPr>
+          <w:p>
+            <w:pPr>
+              <w:pStyle w:val="Sinespaciado"/>
+              <w:jc w:val="center"/>
+              <w:rPr>
+                <w:rFonts w:ascii="Arial" w:hAnsi="Arial" w:cs="Arial"/>
+                <w:lang w:val="es-ES" w:eastAsia="es-EC"/>
+              </w:rPr>
+            </w:pPr>
+            <w:r>
+              <w:rPr>
+                <w:rFonts w:ascii="Arial" w:hAnsi="Arial" w:cs="Arial"/>
+                <w:lang w:val="es-ES" w:eastAsia="es-EC"/>
+              </w:rPr>
+              <w:t>Reportes y Métricas</w:t>
             </w:r>
           </w:p>
         </w:tc>
@@ -2526,18 +3149,33 @@
           <w:p>
             <w:pPr>
               <w:pStyle w:val="Sinespaciado"/>
-              <w:jc w:val="center"/>
-              <w:rPr>
-                <w:rFonts w:ascii="Arial" w:hAnsi="Arial" w:cs="Arial"/>
-                <w:lang w:val="es-ES" w:eastAsia="es-EC"/>
-              </w:rPr>
-            </w:pPr>
-            <w:r>
-              <w:rPr>
-                <w:rFonts w:ascii="Arial" w:hAnsi="Arial" w:cs="Arial"/>
-                <w:lang w:val="es-ES" w:eastAsia="es-EC"/>
-              </w:rPr>
-              <w:t>Técnico / Administrador</w:t>
+              <w:rPr>
+                <w:rFonts w:ascii="Arial" w:hAnsi="Arial" w:cs="Arial"/>
+                <w:lang w:val="es-ES" w:eastAsia="es-EC"/>
+              </w:rPr>
+            </w:pPr>
+            <w:r>
+              <w:rPr>
+                <w:rFonts w:ascii="Arial" w:hAnsi="Arial" w:cs="Arial"/>
+                <w:lang w:val="es-ES" w:eastAsia="es-EC"/>
+              </w:rPr>
+              <w:t xml:space="preserve">Generar reportes de tiempo de resolución, </w:t>
+            </w:r>
+            <w:proofErr w:type="gramStart"/>
+            <w:r>
+              <w:rPr>
+                <w:rFonts w:ascii="Arial" w:hAnsi="Arial" w:cs="Arial"/>
+                <w:lang w:val="es-ES" w:eastAsia="es-EC"/>
+              </w:rPr>
+              <w:t>tickets</w:t>
+            </w:r>
+            <w:proofErr w:type="gramEnd"/>
+            <w:r>
+              <w:rPr>
+                <w:rFonts w:ascii="Arial" w:hAnsi="Arial" w:cs="Arial"/>
+                <w:lang w:val="es-ES" w:eastAsia="es-EC"/>
+              </w:rPr>
+              <w:t xml:space="preserve"> por categoría, SLA, etc.</w:t>
             </w:r>
           </w:p>
         </w:tc>
@@ -2561,7 +3199,31 @@
                 <w:rFonts w:ascii="Arial" w:hAnsi="Arial" w:cs="Arial"/>
                 <w:lang w:val="es-ES" w:eastAsia="es-EC"/>
               </w:rPr>
-              <w:t>Alta</w:t>
+              <w:t>Administrador</w:t>
+            </w:r>
+          </w:p>
+        </w:tc>
+        <w:tc>
+          <w:tcPr>
+            <w:tcW w:w="0" w:type="auto"/>
+            <w:vAlign w:val="center"/>
+            <w:hideMark/>
+          </w:tcPr>
+          <w:p>
+            <w:pPr>
+              <w:pStyle w:val="Sinespaciado"/>
+              <w:jc w:val="center"/>
+              <w:rPr>
+                <w:rFonts w:ascii="Arial" w:hAnsi="Arial" w:cs="Arial"/>
+                <w:lang w:val="es-ES" w:eastAsia="es-EC"/>
+              </w:rPr>
+            </w:pPr>
+            <w:r>
+              <w:rPr>
+                <w:rFonts w:ascii="Arial" w:hAnsi="Arial" w:cs="Arial"/>
+                <w:lang w:val="es-ES" w:eastAsia="es-EC"/>
+              </w:rPr>
+              <w:t>Media</w:t>
             </w:r>
           </w:p>
         </w:tc>
@@ -2569,7 +3231,7 @@
       <w:tr>
         <w:tc>
           <w:tcPr>
-            <w:tcW w:w="0" w:type="auto"/>
+            <w:tcW w:w="1129" w:type="dxa"/>
             <w:vAlign w:val="center"/>
             <w:hideMark/>
           </w:tcPr>
@@ -2587,675 +3249,13 @@
                 <w:rFonts w:ascii="Arial" w:hAnsi="Arial" w:cs="Arial"/>
                 <w:lang w:val="es-ES" w:eastAsia="es-EC"/>
               </w:rPr>
-              <w:t>RF-05</w:t>
-            </w:r>
-          </w:p>
-        </w:tc>
-        <w:tc>
-          <w:tcPr>
-            <w:tcW w:w="0" w:type="auto"/>
-            <w:vAlign w:val="center"/>
-            <w:hideMark/>
-          </w:tcPr>
-          <w:p>
-            <w:pPr>
-              <w:pStyle w:val="Sinespaciado"/>
-              <w:jc w:val="center"/>
-              <w:rPr>
-                <w:rFonts w:ascii="Arial" w:hAnsi="Arial" w:cs="Arial"/>
-                <w:lang w:val="es-ES" w:eastAsia="es-EC"/>
-              </w:rPr>
-            </w:pPr>
-            <w:r>
-              <w:rPr>
-                <w:rFonts w:ascii="Arial" w:hAnsi="Arial" w:cs="Arial"/>
-                <w:lang w:val="es-ES" w:eastAsia="es-EC"/>
-              </w:rPr>
-              <w:t xml:space="preserve">Actualización de </w:t>
-            </w:r>
-            <w:proofErr w:type="gramStart"/>
-            <w:r>
-              <w:rPr>
-                <w:rFonts w:ascii="Arial" w:hAnsi="Arial" w:cs="Arial"/>
-                <w:lang w:val="es-ES" w:eastAsia="es-EC"/>
-              </w:rPr>
-              <w:t>Tickets</w:t>
-            </w:r>
-            <w:proofErr w:type="gramEnd"/>
-          </w:p>
-        </w:tc>
-        <w:tc>
-          <w:tcPr>
-            <w:tcW w:w="0" w:type="auto"/>
-            <w:vAlign w:val="center"/>
-            <w:hideMark/>
-          </w:tcPr>
-          <w:p>
-            <w:pPr>
-              <w:pStyle w:val="Sinespaciado"/>
-              <w:rPr>
-                <w:rFonts w:ascii="Arial" w:hAnsi="Arial" w:cs="Arial"/>
-                <w:lang w:val="es-ES" w:eastAsia="es-EC"/>
-              </w:rPr>
-            </w:pPr>
-            <w:r>
-              <w:rPr>
-                <w:rFonts w:ascii="Arial" w:hAnsi="Arial" w:cs="Arial"/>
-                <w:lang w:val="es-ES" w:eastAsia="es-EC"/>
-              </w:rPr>
-              <w:t>Permitir agregar notas, diagnósticos, soluciones y evidencias durante la resolución</w:t>
-            </w:r>
-          </w:p>
-        </w:tc>
-        <w:tc>
-          <w:tcPr>
-            <w:tcW w:w="0" w:type="auto"/>
-            <w:vAlign w:val="center"/>
-            <w:hideMark/>
-          </w:tcPr>
-          <w:p>
-            <w:pPr>
-              <w:pStyle w:val="Sinespaciado"/>
-              <w:jc w:val="center"/>
-              <w:rPr>
-                <w:rFonts w:ascii="Arial" w:hAnsi="Arial" w:cs="Arial"/>
-                <w:lang w:val="es-ES" w:eastAsia="es-EC"/>
-              </w:rPr>
-            </w:pPr>
-            <w:r>
-              <w:rPr>
-                <w:rFonts w:ascii="Arial" w:hAnsi="Arial" w:cs="Arial"/>
-                <w:lang w:val="es-ES" w:eastAsia="es-EC"/>
-              </w:rPr>
-              <w:t>Técnico</w:t>
-            </w:r>
-          </w:p>
-        </w:tc>
-        <w:tc>
-          <w:tcPr>
-            <w:tcW w:w="0" w:type="auto"/>
-            <w:vAlign w:val="center"/>
-            <w:hideMark/>
-          </w:tcPr>
-          <w:p>
-            <w:pPr>
-              <w:pStyle w:val="Sinespaciado"/>
-              <w:jc w:val="center"/>
-              <w:rPr>
-                <w:rFonts w:ascii="Arial" w:hAnsi="Arial" w:cs="Arial"/>
-                <w:lang w:val="es-ES" w:eastAsia="es-EC"/>
-              </w:rPr>
-            </w:pPr>
-            <w:r>
-              <w:rPr>
-                <w:rFonts w:ascii="Arial" w:hAnsi="Arial" w:cs="Arial"/>
-                <w:lang w:val="es-ES" w:eastAsia="es-EC"/>
-              </w:rPr>
-              <w:t>Alta</w:t>
-            </w:r>
-          </w:p>
-        </w:tc>
-      </w:tr>
-      <w:tr>
-        <w:tc>
-          <w:tcPr>
-            <w:tcW w:w="0" w:type="auto"/>
-            <w:vAlign w:val="center"/>
-            <w:hideMark/>
-          </w:tcPr>
-          <w:p>
-            <w:pPr>
-              <w:pStyle w:val="Sinespaciado"/>
-              <w:jc w:val="center"/>
-              <w:rPr>
-                <w:rFonts w:ascii="Arial" w:hAnsi="Arial" w:cs="Arial"/>
-                <w:lang w:val="es-ES" w:eastAsia="es-EC"/>
-              </w:rPr>
-            </w:pPr>
-            <w:r>
-              <w:rPr>
-                <w:rFonts w:ascii="Arial" w:hAnsi="Arial" w:cs="Arial"/>
-                <w:lang w:val="es-ES" w:eastAsia="es-EC"/>
-              </w:rPr>
-              <w:t>RF-06</w:t>
-            </w:r>
-          </w:p>
-        </w:tc>
-        <w:tc>
-          <w:tcPr>
-            <w:tcW w:w="0" w:type="auto"/>
-            <w:vAlign w:val="center"/>
-            <w:hideMark/>
-          </w:tcPr>
-          <w:p>
-            <w:pPr>
-              <w:pStyle w:val="Sinespaciado"/>
-              <w:jc w:val="center"/>
-              <w:rPr>
-                <w:rFonts w:ascii="Arial" w:hAnsi="Arial" w:cs="Arial"/>
-                <w:lang w:val="es-ES" w:eastAsia="es-EC"/>
-              </w:rPr>
-            </w:pPr>
-            <w:r>
-              <w:rPr>
-                <w:rFonts w:ascii="Arial" w:hAnsi="Arial" w:cs="Arial"/>
-                <w:lang w:val="es-ES" w:eastAsia="es-EC"/>
-              </w:rPr>
-              <w:t>Consulta y Seguimiento</w:t>
-            </w:r>
-          </w:p>
-        </w:tc>
-        <w:tc>
-          <w:tcPr>
-            <w:tcW w:w="0" w:type="auto"/>
-            <w:vAlign w:val="center"/>
-            <w:hideMark/>
-          </w:tcPr>
-          <w:p>
-            <w:pPr>
-              <w:pStyle w:val="Sinespaciado"/>
-              <w:rPr>
-                <w:rFonts w:ascii="Arial" w:hAnsi="Arial" w:cs="Arial"/>
-                <w:lang w:val="es-ES" w:eastAsia="es-EC"/>
-              </w:rPr>
-            </w:pPr>
-            <w:r>
-              <w:rPr>
-                <w:rFonts w:ascii="Arial" w:hAnsi="Arial" w:cs="Arial"/>
-                <w:lang w:val="es-ES" w:eastAsia="es-EC"/>
-              </w:rPr>
-              <w:t xml:space="preserve">Búsqueda y filtrado de </w:t>
-            </w:r>
-            <w:proofErr w:type="gramStart"/>
-            <w:r>
-              <w:rPr>
-                <w:rFonts w:ascii="Arial" w:hAnsi="Arial" w:cs="Arial"/>
-                <w:lang w:val="es-ES" w:eastAsia="es-EC"/>
-              </w:rPr>
-              <w:t>tickets</w:t>
-            </w:r>
-            <w:proofErr w:type="gramEnd"/>
-            <w:r>
-              <w:rPr>
-                <w:rFonts w:ascii="Arial" w:hAnsi="Arial" w:cs="Arial"/>
-                <w:lang w:val="es-ES" w:eastAsia="es-EC"/>
-              </w:rPr>
-              <w:t xml:space="preserve"> por estado, categoría, técnico, fecha, etc.</w:t>
-            </w:r>
-          </w:p>
-        </w:tc>
-        <w:tc>
-          <w:tcPr>
-            <w:tcW w:w="0" w:type="auto"/>
-            <w:vAlign w:val="center"/>
-            <w:hideMark/>
-          </w:tcPr>
-          <w:p>
-            <w:pPr>
-              <w:pStyle w:val="Sinespaciado"/>
-              <w:jc w:val="center"/>
-              <w:rPr>
-                <w:rFonts w:ascii="Arial" w:hAnsi="Arial" w:cs="Arial"/>
-                <w:lang w:val="es-ES" w:eastAsia="es-EC"/>
-              </w:rPr>
-            </w:pPr>
-            <w:r>
-              <w:rPr>
-                <w:rFonts w:ascii="Arial" w:hAnsi="Arial" w:cs="Arial"/>
-                <w:lang w:val="es-ES" w:eastAsia="es-EC"/>
-              </w:rPr>
-              <w:t>Todos los actores</w:t>
-            </w:r>
-          </w:p>
-        </w:tc>
-        <w:tc>
-          <w:tcPr>
-            <w:tcW w:w="0" w:type="auto"/>
-            <w:vAlign w:val="center"/>
-            <w:hideMark/>
-          </w:tcPr>
-          <w:p>
-            <w:pPr>
-              <w:pStyle w:val="Sinespaciado"/>
-              <w:jc w:val="center"/>
-              <w:rPr>
-                <w:rFonts w:ascii="Arial" w:hAnsi="Arial" w:cs="Arial"/>
-                <w:lang w:val="es-ES" w:eastAsia="es-EC"/>
-              </w:rPr>
-            </w:pPr>
-            <w:r>
-              <w:rPr>
-                <w:rFonts w:ascii="Arial" w:hAnsi="Arial" w:cs="Arial"/>
-                <w:lang w:val="es-ES" w:eastAsia="es-EC"/>
-              </w:rPr>
-              <w:t>Alta</w:t>
-            </w:r>
-          </w:p>
-        </w:tc>
-      </w:tr>
-      <w:tr>
-        <w:tc>
-          <w:tcPr>
-            <w:tcW w:w="0" w:type="auto"/>
-            <w:vAlign w:val="center"/>
-            <w:hideMark/>
-          </w:tcPr>
-          <w:p>
-            <w:pPr>
-              <w:pStyle w:val="Sinespaciado"/>
-              <w:jc w:val="center"/>
-              <w:rPr>
-                <w:rFonts w:ascii="Arial" w:hAnsi="Arial" w:cs="Arial"/>
-                <w:lang w:val="es-ES" w:eastAsia="es-EC"/>
-              </w:rPr>
-            </w:pPr>
-            <w:r>
-              <w:rPr>
-                <w:rFonts w:ascii="Arial" w:hAnsi="Arial" w:cs="Arial"/>
-                <w:lang w:val="es-ES" w:eastAsia="es-EC"/>
-              </w:rPr>
-              <w:t>RF-07</w:t>
-            </w:r>
-          </w:p>
-        </w:tc>
-        <w:tc>
-          <w:tcPr>
-            <w:tcW w:w="0" w:type="auto"/>
-            <w:vAlign w:val="center"/>
-            <w:hideMark/>
-          </w:tcPr>
-          <w:p>
-            <w:pPr>
-              <w:pStyle w:val="Sinespaciado"/>
-              <w:jc w:val="center"/>
-              <w:rPr>
-                <w:rFonts w:ascii="Arial" w:hAnsi="Arial" w:cs="Arial"/>
-                <w:lang w:val="es-ES" w:eastAsia="es-EC"/>
-              </w:rPr>
-            </w:pPr>
-            <w:r>
-              <w:rPr>
-                <w:rFonts w:ascii="Arial" w:hAnsi="Arial" w:cs="Arial"/>
-                <w:lang w:val="es-ES" w:eastAsia="es-EC"/>
-              </w:rPr>
-              <w:t>Notificaciones</w:t>
-            </w:r>
-          </w:p>
-        </w:tc>
-        <w:tc>
-          <w:tcPr>
-            <w:tcW w:w="0" w:type="auto"/>
-            <w:vAlign w:val="center"/>
-            <w:hideMark/>
-          </w:tcPr>
-          <w:p>
-            <w:pPr>
-              <w:pStyle w:val="Sinespaciado"/>
-              <w:rPr>
-                <w:rFonts w:ascii="Arial" w:hAnsi="Arial" w:cs="Arial"/>
-                <w:lang w:val="es-ES" w:eastAsia="es-EC"/>
-              </w:rPr>
-            </w:pPr>
-            <w:r>
-              <w:rPr>
-                <w:rFonts w:ascii="Arial" w:hAnsi="Arial" w:cs="Arial"/>
-                <w:lang w:val="es-ES" w:eastAsia="es-EC"/>
-              </w:rPr>
-              <w:t xml:space="preserve">Enviar notificaciones automáticas por cambio de estado o asignación (email y/o </w:t>
-            </w:r>
-            <w:proofErr w:type="spellStart"/>
-            <w:r>
-              <w:rPr>
-                <w:rFonts w:ascii="Arial" w:hAnsi="Arial" w:cs="Arial"/>
-                <w:lang w:val="es-ES" w:eastAsia="es-EC"/>
-              </w:rPr>
-              <w:t>dashboard</w:t>
-            </w:r>
-            <w:proofErr w:type="spellEnd"/>
-            <w:r>
-              <w:rPr>
-                <w:rFonts w:ascii="Arial" w:hAnsi="Arial" w:cs="Arial"/>
-                <w:lang w:val="es-ES" w:eastAsia="es-EC"/>
-              </w:rPr>
-              <w:t>)</w:t>
-            </w:r>
-          </w:p>
-        </w:tc>
-        <w:tc>
-          <w:tcPr>
-            <w:tcW w:w="0" w:type="auto"/>
-            <w:vAlign w:val="center"/>
-            <w:hideMark/>
-          </w:tcPr>
-          <w:p>
-            <w:pPr>
-              <w:pStyle w:val="Sinespaciado"/>
-              <w:jc w:val="center"/>
-              <w:rPr>
-                <w:rFonts w:ascii="Arial" w:hAnsi="Arial" w:cs="Arial"/>
-                <w:lang w:val="es-ES" w:eastAsia="es-EC"/>
-              </w:rPr>
-            </w:pPr>
-            <w:r>
-              <w:rPr>
-                <w:rFonts w:ascii="Arial" w:hAnsi="Arial" w:cs="Arial"/>
-                <w:lang w:val="es-ES" w:eastAsia="es-EC"/>
-              </w:rPr>
-              <w:t>Sistema</w:t>
-            </w:r>
-          </w:p>
-        </w:tc>
-        <w:tc>
-          <w:tcPr>
-            <w:tcW w:w="0" w:type="auto"/>
-            <w:vAlign w:val="center"/>
-            <w:hideMark/>
-          </w:tcPr>
-          <w:p>
-            <w:pPr>
-              <w:pStyle w:val="Sinespaciado"/>
-              <w:jc w:val="center"/>
-              <w:rPr>
-                <w:rFonts w:ascii="Arial" w:hAnsi="Arial" w:cs="Arial"/>
-                <w:lang w:val="es-ES" w:eastAsia="es-EC"/>
-              </w:rPr>
-            </w:pPr>
-            <w:r>
-              <w:rPr>
-                <w:rFonts w:ascii="Arial" w:hAnsi="Arial" w:cs="Arial"/>
-                <w:lang w:val="es-ES" w:eastAsia="es-EC"/>
-              </w:rPr>
-              <w:t>Media</w:t>
-            </w:r>
-          </w:p>
-        </w:tc>
-      </w:tr>
-      <w:tr>
-        <w:tc>
-          <w:tcPr>
-            <w:tcW w:w="0" w:type="auto"/>
-            <w:vAlign w:val="center"/>
-            <w:hideMark/>
-          </w:tcPr>
-          <w:p>
-            <w:pPr>
-              <w:pStyle w:val="Sinespaciado"/>
-              <w:jc w:val="center"/>
-              <w:rPr>
-                <w:rFonts w:ascii="Arial" w:hAnsi="Arial" w:cs="Arial"/>
-                <w:lang w:val="es-ES" w:eastAsia="es-EC"/>
-              </w:rPr>
-            </w:pPr>
-            <w:r>
-              <w:rPr>
-                <w:rFonts w:ascii="Arial" w:hAnsi="Arial" w:cs="Arial"/>
-                <w:lang w:val="es-ES" w:eastAsia="es-EC"/>
-              </w:rPr>
-              <w:t>RF-08</w:t>
-            </w:r>
-          </w:p>
-        </w:tc>
-        <w:tc>
-          <w:tcPr>
-            <w:tcW w:w="0" w:type="auto"/>
-            <w:vAlign w:val="center"/>
-            <w:hideMark/>
-          </w:tcPr>
-          <w:p>
-            <w:pPr>
-              <w:pStyle w:val="Sinespaciado"/>
-              <w:jc w:val="center"/>
-              <w:rPr>
-                <w:rFonts w:ascii="Arial" w:hAnsi="Arial" w:cs="Arial"/>
-                <w:lang w:val="es-ES" w:eastAsia="es-EC"/>
-              </w:rPr>
-            </w:pPr>
-            <w:r>
-              <w:rPr>
-                <w:rFonts w:ascii="Arial" w:hAnsi="Arial" w:cs="Arial"/>
-                <w:lang w:val="es-ES" w:eastAsia="es-EC"/>
-              </w:rPr>
-              <w:t>Gestión de Técnicos</w:t>
-            </w:r>
-          </w:p>
-        </w:tc>
-        <w:tc>
-          <w:tcPr>
-            <w:tcW w:w="0" w:type="auto"/>
-            <w:vAlign w:val="center"/>
-            <w:hideMark/>
-          </w:tcPr>
-          <w:p>
-            <w:pPr>
-              <w:pStyle w:val="Sinespaciado"/>
-              <w:rPr>
-                <w:rFonts w:ascii="Arial" w:hAnsi="Arial" w:cs="Arial"/>
-                <w:lang w:val="es-ES" w:eastAsia="es-EC"/>
-              </w:rPr>
-            </w:pPr>
-            <w:r>
-              <w:rPr>
-                <w:rFonts w:ascii="Arial" w:hAnsi="Arial" w:cs="Arial"/>
-                <w:lang w:val="es-ES" w:eastAsia="es-EC"/>
-              </w:rPr>
-              <w:t>Registrar técnicos con sus especialidades y disponibilidad</w:t>
-            </w:r>
-          </w:p>
-        </w:tc>
-        <w:tc>
-          <w:tcPr>
-            <w:tcW w:w="0" w:type="auto"/>
-            <w:vAlign w:val="center"/>
-            <w:hideMark/>
-          </w:tcPr>
-          <w:p>
-            <w:pPr>
-              <w:pStyle w:val="Sinespaciado"/>
-              <w:jc w:val="center"/>
-              <w:rPr>
-                <w:rFonts w:ascii="Arial" w:hAnsi="Arial" w:cs="Arial"/>
-                <w:lang w:val="es-ES" w:eastAsia="es-EC"/>
-              </w:rPr>
-            </w:pPr>
-            <w:r>
-              <w:rPr>
-                <w:rFonts w:ascii="Arial" w:hAnsi="Arial" w:cs="Arial"/>
-                <w:lang w:val="es-ES" w:eastAsia="es-EC"/>
-              </w:rPr>
-              <w:t>Administrador</w:t>
-            </w:r>
-          </w:p>
-        </w:tc>
-        <w:tc>
-          <w:tcPr>
-            <w:tcW w:w="0" w:type="auto"/>
-            <w:vAlign w:val="center"/>
-            <w:hideMark/>
-          </w:tcPr>
-          <w:p>
-            <w:pPr>
-              <w:pStyle w:val="Sinespaciado"/>
-              <w:jc w:val="center"/>
-              <w:rPr>
-                <w:rFonts w:ascii="Arial" w:hAnsi="Arial" w:cs="Arial"/>
-                <w:lang w:val="es-ES" w:eastAsia="es-EC"/>
-              </w:rPr>
-            </w:pPr>
-            <w:r>
-              <w:rPr>
-                <w:rFonts w:ascii="Arial" w:hAnsi="Arial" w:cs="Arial"/>
-                <w:lang w:val="es-ES" w:eastAsia="es-EC"/>
-              </w:rPr>
-              <w:t>Media</w:t>
-            </w:r>
-          </w:p>
-        </w:tc>
-      </w:tr>
-      <w:tr>
-        <w:tc>
-          <w:tcPr>
-            <w:tcW w:w="0" w:type="auto"/>
-            <w:vAlign w:val="center"/>
-            <w:hideMark/>
-          </w:tcPr>
-          <w:p>
-            <w:pPr>
-              <w:pStyle w:val="Sinespaciado"/>
-              <w:jc w:val="center"/>
-              <w:rPr>
-                <w:rFonts w:ascii="Arial" w:hAnsi="Arial" w:cs="Arial"/>
-                <w:lang w:val="es-ES" w:eastAsia="es-EC"/>
-              </w:rPr>
-            </w:pPr>
-            <w:r>
-              <w:rPr>
-                <w:rFonts w:ascii="Arial" w:hAnsi="Arial" w:cs="Arial"/>
-                <w:lang w:val="es-ES" w:eastAsia="es-EC"/>
-              </w:rPr>
-              <w:t>RF-09</w:t>
-            </w:r>
-          </w:p>
-        </w:tc>
-        <w:tc>
-          <w:tcPr>
-            <w:tcW w:w="0" w:type="auto"/>
-            <w:vAlign w:val="center"/>
-            <w:hideMark/>
-          </w:tcPr>
-          <w:p>
-            <w:pPr>
-              <w:pStyle w:val="Sinespaciado"/>
-              <w:jc w:val="center"/>
-              <w:rPr>
-                <w:rFonts w:ascii="Arial" w:hAnsi="Arial" w:cs="Arial"/>
-                <w:lang w:val="es-ES" w:eastAsia="es-EC"/>
-              </w:rPr>
-            </w:pPr>
-            <w:r>
-              <w:rPr>
-                <w:rFonts w:ascii="Arial" w:hAnsi="Arial" w:cs="Arial"/>
-                <w:lang w:val="es-ES" w:eastAsia="es-EC"/>
-              </w:rPr>
-              <w:t>Reportes y Métricas</w:t>
-            </w:r>
-          </w:p>
-        </w:tc>
-        <w:tc>
-          <w:tcPr>
-            <w:tcW w:w="0" w:type="auto"/>
-            <w:vAlign w:val="center"/>
-            <w:hideMark/>
-          </w:tcPr>
-          <w:p>
-            <w:pPr>
-              <w:pStyle w:val="Sinespaciado"/>
-              <w:rPr>
-                <w:rFonts w:ascii="Arial" w:hAnsi="Arial" w:cs="Arial"/>
-                <w:lang w:val="es-ES" w:eastAsia="es-EC"/>
-              </w:rPr>
-            </w:pPr>
-            <w:r>
-              <w:rPr>
-                <w:rFonts w:ascii="Arial" w:hAnsi="Arial" w:cs="Arial"/>
-                <w:lang w:val="es-ES" w:eastAsia="es-EC"/>
-              </w:rPr>
-              <w:t xml:space="preserve">Generar reportes de tiempo de resolución, </w:t>
-            </w:r>
-            <w:proofErr w:type="gramStart"/>
-            <w:r>
-              <w:rPr>
-                <w:rFonts w:ascii="Arial" w:hAnsi="Arial" w:cs="Arial"/>
-                <w:lang w:val="es-ES" w:eastAsia="es-EC"/>
-              </w:rPr>
-              <w:t>tickets</w:t>
-            </w:r>
-            <w:proofErr w:type="gramEnd"/>
-            <w:r>
-              <w:rPr>
-                <w:rFonts w:ascii="Arial" w:hAnsi="Arial" w:cs="Arial"/>
-                <w:lang w:val="es-ES" w:eastAsia="es-EC"/>
-              </w:rPr>
-              <w:t xml:space="preserve"> por categoría, SLA, etc.</w:t>
-            </w:r>
-          </w:p>
-        </w:tc>
-        <w:tc>
-          <w:tcPr>
-            <w:tcW w:w="0" w:type="auto"/>
-            <w:vAlign w:val="center"/>
-            <w:hideMark/>
-          </w:tcPr>
-          <w:p>
-            <w:pPr>
-              <w:pStyle w:val="Sinespaciado"/>
-              <w:jc w:val="center"/>
-              <w:rPr>
-                <w:rFonts w:ascii="Arial" w:hAnsi="Arial" w:cs="Arial"/>
-                <w:lang w:val="es-ES" w:eastAsia="es-EC"/>
-              </w:rPr>
-            </w:pPr>
-            <w:r>
-              <w:rPr>
-                <w:rFonts w:ascii="Arial" w:hAnsi="Arial" w:cs="Arial"/>
-                <w:lang w:val="es-ES" w:eastAsia="es-EC"/>
-              </w:rPr>
-              <w:t>Administrador</w:t>
-            </w:r>
-          </w:p>
-        </w:tc>
-        <w:tc>
-          <w:tcPr>
-            <w:tcW w:w="0" w:type="auto"/>
-            <w:vAlign w:val="center"/>
-            <w:hideMark/>
-          </w:tcPr>
-          <w:p>
-            <w:pPr>
-              <w:pStyle w:val="Sinespaciado"/>
-              <w:jc w:val="center"/>
-              <w:rPr>
-                <w:rFonts w:ascii="Arial" w:hAnsi="Arial" w:cs="Arial"/>
-                <w:lang w:val="es-ES" w:eastAsia="es-EC"/>
-              </w:rPr>
-            </w:pPr>
-            <w:r>
-              <w:rPr>
-                <w:rFonts w:ascii="Arial" w:hAnsi="Arial" w:cs="Arial"/>
-                <w:lang w:val="es-ES" w:eastAsia="es-EC"/>
-              </w:rPr>
-              <w:t>Media</w:t>
-            </w:r>
-          </w:p>
-        </w:tc>
-      </w:tr>
-      <w:tr>
-        <w:tc>
-          <w:tcPr>
-            <w:tcW w:w="0" w:type="auto"/>
-            <w:vAlign w:val="center"/>
-            <w:hideMark/>
-          </w:tcPr>
-          <w:p>
-            <w:pPr>
-              <w:pStyle w:val="Sinespaciado"/>
-              <w:jc w:val="center"/>
-              <w:rPr>
-                <w:rFonts w:ascii="Arial" w:hAnsi="Arial" w:cs="Arial"/>
-                <w:lang w:val="es-ES" w:eastAsia="es-EC"/>
-              </w:rPr>
-            </w:pPr>
-            <w:r>
-              <w:rPr>
-                <w:rFonts w:ascii="Arial" w:hAnsi="Arial" w:cs="Arial"/>
-                <w:lang w:val="es-ES" w:eastAsia="es-EC"/>
-              </w:rPr>
               <w:t>RF-10</w:t>
             </w:r>
           </w:p>
         </w:tc>
         <w:tc>
           <w:tcPr>
-            <w:tcW w:w="0" w:type="auto"/>
+            <w:tcW w:w="1454" w:type="dxa"/>
             <w:vAlign w:val="center"/>
             <w:hideMark/>
           </w:tcPr>
@@ -3377,6 +3377,1145 @@
         </w:rPr>
       </w:pPr>
     </w:p>
+    <w:p>
+      <w:pPr>
+        <w:rPr>
+          <w:rFonts w:ascii="Arial" w:hAnsi="Arial" w:cs="Arial"/>
+          <w:b/>
+          <w:bCs/>
+          <w:lang w:val="es-ES" w:eastAsia="es-EC"/>
+        </w:rPr>
+      </w:pPr>
+      <w:r>
+        <w:rPr>
+          <w:rFonts w:ascii="Arial" w:hAnsi="Arial" w:cs="Arial"/>
+          <w:b/>
+          <w:bCs/>
+          <w:lang w:val="es-ES" w:eastAsia="es-EC"/>
+        </w:rPr>
+        <w:t>Requerimientos No Funcionales</w:t>
+      </w:r>
+    </w:p>
+    <w:tbl>
+      <w:tblPr>
+        <w:tblStyle w:val="Tablaconcuadrculaclara"/>
+        <w:tblW w:w="0" w:type="auto"/>
+        <w:tblLook w:val="04A0" w:firstRow="1" w:lastRow="0" w:firstColumn="1" w:lastColumn="0" w:noHBand="0" w:noVBand="1"/>
+      </w:tblPr>
+      <w:tblGrid>
+        <w:gridCol w:w="1129"/>
+        <w:gridCol w:w="1956"/>
+        <w:gridCol w:w="4227"/>
+        <w:gridCol w:w="1182"/>
+      </w:tblGrid>
+      <w:tr>
+        <w:tc>
+          <w:tcPr>
+            <w:tcW w:w="1129" w:type="dxa"/>
+            <w:vAlign w:val="center"/>
+            <w:hideMark/>
+          </w:tcPr>
+          <w:p>
+            <w:pPr>
+              <w:spacing w:after="160"/>
+              <w:jc w:val="center"/>
+              <w:rPr>
+                <w:rFonts w:ascii="Arial" w:hAnsi="Arial" w:cs="Arial"/>
+                <w:b/>
+                <w:bCs/>
+                <w:lang w:val="es-ES" w:eastAsia="es-EC"/>
+              </w:rPr>
+            </w:pPr>
+            <w:r>
+              <w:rPr>
+                <w:rFonts w:ascii="Arial" w:hAnsi="Arial" w:cs="Arial"/>
+                <w:b/>
+                <w:bCs/>
+                <w:lang w:val="es-ES" w:eastAsia="es-EC"/>
+              </w:rPr>
+              <w:t>ID</w:t>
+            </w:r>
+          </w:p>
+        </w:tc>
+        <w:tc>
+          <w:tcPr>
+            <w:tcW w:w="1956" w:type="dxa"/>
+            <w:vAlign w:val="center"/>
+            <w:hideMark/>
+          </w:tcPr>
+          <w:p>
+            <w:pPr>
+              <w:spacing w:after="160"/>
+              <w:jc w:val="center"/>
+              <w:rPr>
+                <w:rFonts w:ascii="Arial" w:hAnsi="Arial" w:cs="Arial"/>
+                <w:b/>
+                <w:bCs/>
+                <w:lang w:val="es-ES" w:eastAsia="es-EC"/>
+              </w:rPr>
+            </w:pPr>
+            <w:r>
+              <w:rPr>
+                <w:rFonts w:ascii="Arial" w:hAnsi="Arial" w:cs="Arial"/>
+                <w:b/>
+                <w:bCs/>
+                <w:lang w:val="es-ES" w:eastAsia="es-EC"/>
+              </w:rPr>
+              <w:t>Requerimiento No Funcional</w:t>
+            </w:r>
+          </w:p>
+        </w:tc>
+        <w:tc>
+          <w:tcPr>
+            <w:tcW w:w="0" w:type="auto"/>
+            <w:vAlign w:val="center"/>
+            <w:hideMark/>
+          </w:tcPr>
+          <w:p>
+            <w:pPr>
+              <w:spacing w:after="160"/>
+              <w:jc w:val="center"/>
+              <w:rPr>
+                <w:rFonts w:ascii="Arial" w:hAnsi="Arial" w:cs="Arial"/>
+                <w:b/>
+                <w:bCs/>
+                <w:lang w:val="es-ES" w:eastAsia="es-EC"/>
+              </w:rPr>
+            </w:pPr>
+            <w:r>
+              <w:rPr>
+                <w:rFonts w:ascii="Arial" w:hAnsi="Arial" w:cs="Arial"/>
+                <w:b/>
+                <w:bCs/>
+                <w:lang w:val="es-ES" w:eastAsia="es-EC"/>
+              </w:rPr>
+              <w:t>Descripción</w:t>
+            </w:r>
+          </w:p>
+        </w:tc>
+        <w:tc>
+          <w:tcPr>
+            <w:tcW w:w="0" w:type="auto"/>
+            <w:vAlign w:val="center"/>
+            <w:hideMark/>
+          </w:tcPr>
+          <w:p>
+            <w:pPr>
+              <w:spacing w:after="160"/>
+              <w:jc w:val="center"/>
+              <w:rPr>
+                <w:rFonts w:ascii="Arial" w:hAnsi="Arial" w:cs="Arial"/>
+                <w:b/>
+                <w:bCs/>
+                <w:lang w:val="es-ES" w:eastAsia="es-EC"/>
+              </w:rPr>
+            </w:pPr>
+            <w:r>
+              <w:rPr>
+                <w:rFonts w:ascii="Arial" w:hAnsi="Arial" w:cs="Arial"/>
+                <w:b/>
+                <w:bCs/>
+                <w:lang w:val="es-ES" w:eastAsia="es-EC"/>
+              </w:rPr>
+              <w:t>Prioridad</w:t>
+            </w:r>
+          </w:p>
+        </w:tc>
+      </w:tr>
+      <w:tr>
+        <w:tc>
+          <w:tcPr>
+            <w:tcW w:w="1129" w:type="dxa"/>
+            <w:vAlign w:val="center"/>
+            <w:hideMark/>
+          </w:tcPr>
+          <w:p>
+            <w:pPr>
+              <w:spacing w:after="160"/>
+              <w:jc w:val="center"/>
+              <w:rPr>
+                <w:rFonts w:ascii="Arial" w:hAnsi="Arial" w:cs="Arial"/>
+                <w:lang w:val="es-ES" w:eastAsia="es-EC"/>
+              </w:rPr>
+            </w:pPr>
+            <w:r>
+              <w:rPr>
+                <w:rFonts w:ascii="Arial" w:hAnsi="Arial" w:cs="Arial"/>
+                <w:lang w:val="es-ES" w:eastAsia="es-EC"/>
+              </w:rPr>
+              <w:t>RNF-01</w:t>
+            </w:r>
+          </w:p>
+        </w:tc>
+        <w:tc>
+          <w:tcPr>
+            <w:tcW w:w="1956" w:type="dxa"/>
+            <w:vAlign w:val="center"/>
+            <w:hideMark/>
+          </w:tcPr>
+          <w:p>
+            <w:pPr>
+              <w:spacing w:after="160"/>
+              <w:jc w:val="center"/>
+              <w:rPr>
+                <w:rFonts w:ascii="Arial" w:hAnsi="Arial" w:cs="Arial"/>
+                <w:lang w:val="es-ES" w:eastAsia="es-EC"/>
+              </w:rPr>
+            </w:pPr>
+            <w:r>
+              <w:rPr>
+                <w:rFonts w:ascii="Arial" w:hAnsi="Arial" w:cs="Arial"/>
+                <w:lang w:val="es-ES" w:eastAsia="es-EC"/>
+              </w:rPr>
+              <w:t>Escalabilidad</w:t>
+            </w:r>
+          </w:p>
+        </w:tc>
+        <w:tc>
+          <w:tcPr>
+            <w:tcW w:w="0" w:type="auto"/>
+            <w:hideMark/>
+          </w:tcPr>
+          <w:p>
+            <w:pPr>
+              <w:spacing w:after="160"/>
+              <w:rPr>
+                <w:rFonts w:ascii="Arial" w:hAnsi="Arial" w:cs="Arial"/>
+                <w:lang w:val="es-ES" w:eastAsia="es-EC"/>
+              </w:rPr>
+            </w:pPr>
+            <w:r>
+              <w:rPr>
+                <w:rFonts w:ascii="Arial" w:hAnsi="Arial" w:cs="Arial"/>
+                <w:lang w:val="es-ES" w:eastAsia="es-EC"/>
+              </w:rPr>
+              <w:t xml:space="preserve">El sistema debe soportar al menos 500 </w:t>
+            </w:r>
+            <w:proofErr w:type="gramStart"/>
+            <w:r>
+              <w:rPr>
+                <w:rFonts w:ascii="Arial" w:hAnsi="Arial" w:cs="Arial"/>
+                <w:lang w:val="es-ES" w:eastAsia="es-EC"/>
+              </w:rPr>
+              <w:t>tickets</w:t>
+            </w:r>
+            <w:proofErr w:type="gramEnd"/>
+            <w:r>
+              <w:rPr>
+                <w:rFonts w:ascii="Arial" w:hAnsi="Arial" w:cs="Arial"/>
+                <w:lang w:val="es-ES" w:eastAsia="es-EC"/>
+              </w:rPr>
+              <w:t xml:space="preserve"> simultáneos y crecimiento futuro</w:t>
+            </w:r>
+          </w:p>
+        </w:tc>
+        <w:tc>
+          <w:tcPr>
+            <w:tcW w:w="0" w:type="auto"/>
+            <w:vAlign w:val="center"/>
+            <w:hideMark/>
+          </w:tcPr>
+          <w:p>
+            <w:pPr>
+              <w:spacing w:after="160"/>
+              <w:jc w:val="center"/>
+              <w:rPr>
+                <w:rFonts w:ascii="Arial" w:hAnsi="Arial" w:cs="Arial"/>
+                <w:lang w:val="es-ES" w:eastAsia="es-EC"/>
+              </w:rPr>
+            </w:pPr>
+            <w:r>
+              <w:rPr>
+                <w:rFonts w:ascii="Arial" w:hAnsi="Arial" w:cs="Arial"/>
+                <w:lang w:val="es-ES" w:eastAsia="es-EC"/>
+              </w:rPr>
+              <w:t>Alta</w:t>
+            </w:r>
+          </w:p>
+        </w:tc>
+      </w:tr>
+      <w:tr>
+        <w:tc>
+          <w:tcPr>
+            <w:tcW w:w="1129" w:type="dxa"/>
+            <w:vAlign w:val="center"/>
+            <w:hideMark/>
+          </w:tcPr>
+          <w:p>
+            <w:pPr>
+              <w:spacing w:after="160"/>
+              <w:jc w:val="center"/>
+              <w:rPr>
+                <w:rFonts w:ascii="Arial" w:hAnsi="Arial" w:cs="Arial"/>
+                <w:lang w:val="es-ES" w:eastAsia="es-EC"/>
+              </w:rPr>
+            </w:pPr>
+            <w:r>
+              <w:rPr>
+                <w:rFonts w:ascii="Arial" w:hAnsi="Arial" w:cs="Arial"/>
+                <w:lang w:val="es-ES" w:eastAsia="es-EC"/>
+              </w:rPr>
+              <w:t>RNF-02</w:t>
+            </w:r>
+          </w:p>
+        </w:tc>
+        <w:tc>
+          <w:tcPr>
+            <w:tcW w:w="1956" w:type="dxa"/>
+            <w:vAlign w:val="center"/>
+            <w:hideMark/>
+          </w:tcPr>
+          <w:p>
+            <w:pPr>
+              <w:spacing w:after="160"/>
+              <w:jc w:val="center"/>
+              <w:rPr>
+                <w:rFonts w:ascii="Arial" w:hAnsi="Arial" w:cs="Arial"/>
+                <w:lang w:val="es-ES" w:eastAsia="es-EC"/>
+              </w:rPr>
+            </w:pPr>
+            <w:r>
+              <w:rPr>
+                <w:rFonts w:ascii="Arial" w:hAnsi="Arial" w:cs="Arial"/>
+                <w:lang w:val="es-ES" w:eastAsia="es-EC"/>
+              </w:rPr>
+              <w:t>Mantenibilidad</w:t>
+            </w:r>
+          </w:p>
+        </w:tc>
+        <w:tc>
+          <w:tcPr>
+            <w:tcW w:w="0" w:type="auto"/>
+            <w:hideMark/>
+          </w:tcPr>
+          <w:p>
+            <w:pPr>
+              <w:spacing w:after="160"/>
+              <w:rPr>
+                <w:rFonts w:ascii="Arial" w:hAnsi="Arial" w:cs="Arial"/>
+                <w:lang w:val="es-ES" w:eastAsia="es-EC"/>
+              </w:rPr>
+            </w:pPr>
+            <w:r>
+              <w:rPr>
+                <w:rFonts w:ascii="Arial" w:hAnsi="Arial" w:cs="Arial"/>
+                <w:lang w:val="es-ES" w:eastAsia="es-EC"/>
+              </w:rPr>
+              <w:t>Código modular, bien documentado y fácil de extender (nuevas categorías o integraciones)</w:t>
+            </w:r>
+          </w:p>
+        </w:tc>
+        <w:tc>
+          <w:tcPr>
+            <w:tcW w:w="0" w:type="auto"/>
+            <w:vAlign w:val="center"/>
+            <w:hideMark/>
+          </w:tcPr>
+          <w:p>
+            <w:pPr>
+              <w:spacing w:after="160"/>
+              <w:jc w:val="center"/>
+              <w:rPr>
+                <w:rFonts w:ascii="Arial" w:hAnsi="Arial" w:cs="Arial"/>
+                <w:lang w:val="es-ES" w:eastAsia="es-EC"/>
+              </w:rPr>
+            </w:pPr>
+            <w:r>
+              <w:rPr>
+                <w:rFonts w:ascii="Arial" w:hAnsi="Arial" w:cs="Arial"/>
+                <w:lang w:val="es-ES" w:eastAsia="es-EC"/>
+              </w:rPr>
+              <w:t>Alta</w:t>
+            </w:r>
+          </w:p>
+        </w:tc>
+      </w:tr>
+      <w:tr>
+        <w:tc>
+          <w:tcPr>
+            <w:tcW w:w="1129" w:type="dxa"/>
+            <w:vAlign w:val="center"/>
+            <w:hideMark/>
+          </w:tcPr>
+          <w:p>
+            <w:pPr>
+              <w:spacing w:after="160"/>
+              <w:jc w:val="center"/>
+              <w:rPr>
+                <w:rFonts w:ascii="Arial" w:hAnsi="Arial" w:cs="Arial"/>
+                <w:lang w:val="es-ES" w:eastAsia="es-EC"/>
+              </w:rPr>
+            </w:pPr>
+            <w:r>
+              <w:rPr>
+                <w:rFonts w:ascii="Arial" w:hAnsi="Arial" w:cs="Arial"/>
+                <w:lang w:val="es-ES" w:eastAsia="es-EC"/>
+              </w:rPr>
+              <w:t>RNF-03</w:t>
+            </w:r>
+          </w:p>
+        </w:tc>
+        <w:tc>
+          <w:tcPr>
+            <w:tcW w:w="1956" w:type="dxa"/>
+            <w:vAlign w:val="center"/>
+            <w:hideMark/>
+          </w:tcPr>
+          <w:p>
+            <w:pPr>
+              <w:spacing w:after="160"/>
+              <w:jc w:val="center"/>
+              <w:rPr>
+                <w:rFonts w:ascii="Arial" w:hAnsi="Arial" w:cs="Arial"/>
+                <w:lang w:val="es-ES" w:eastAsia="es-EC"/>
+              </w:rPr>
+            </w:pPr>
+            <w:r>
+              <w:rPr>
+                <w:rFonts w:ascii="Arial" w:hAnsi="Arial" w:cs="Arial"/>
+                <w:lang w:val="es-ES" w:eastAsia="es-EC"/>
+              </w:rPr>
+              <w:t>Trazabilidad de Versiones</w:t>
+            </w:r>
+          </w:p>
+        </w:tc>
+        <w:tc>
+          <w:tcPr>
+            <w:tcW w:w="0" w:type="auto"/>
+            <w:hideMark/>
+          </w:tcPr>
+          <w:p>
+            <w:pPr>
+              <w:spacing w:after="160"/>
+              <w:rPr>
+                <w:rFonts w:ascii="Arial" w:hAnsi="Arial" w:cs="Arial"/>
+                <w:lang w:val="es-ES" w:eastAsia="es-EC"/>
+              </w:rPr>
+            </w:pPr>
+            <w:r>
+              <w:rPr>
+                <w:rFonts w:ascii="Arial" w:hAnsi="Arial" w:cs="Arial"/>
+                <w:lang w:val="es-ES" w:eastAsia="es-EC"/>
+              </w:rPr>
+              <w:t xml:space="preserve">Uso obligatorio del modelo </w:t>
+            </w:r>
+            <w:proofErr w:type="spellStart"/>
+            <w:r>
+              <w:rPr>
+                <w:rFonts w:ascii="Arial" w:hAnsi="Arial" w:cs="Arial"/>
+                <w:lang w:val="es-ES" w:eastAsia="es-EC"/>
+              </w:rPr>
+              <w:t>Gitflow</w:t>
+            </w:r>
+            <w:proofErr w:type="spellEnd"/>
+            <w:r>
+              <w:rPr>
+                <w:rFonts w:ascii="Arial" w:hAnsi="Arial" w:cs="Arial"/>
+                <w:lang w:val="es-ES" w:eastAsia="es-EC"/>
+              </w:rPr>
+              <w:t xml:space="preserve"> en repositorio GitHub</w:t>
+            </w:r>
+          </w:p>
+        </w:tc>
+        <w:tc>
+          <w:tcPr>
+            <w:tcW w:w="0" w:type="auto"/>
+            <w:vAlign w:val="center"/>
+            <w:hideMark/>
+          </w:tcPr>
+          <w:p>
+            <w:pPr>
+              <w:spacing w:after="160"/>
+              <w:jc w:val="center"/>
+              <w:rPr>
+                <w:rFonts w:ascii="Arial" w:hAnsi="Arial" w:cs="Arial"/>
+                <w:lang w:val="es-ES" w:eastAsia="es-EC"/>
+              </w:rPr>
+            </w:pPr>
+            <w:r>
+              <w:rPr>
+                <w:rFonts w:ascii="Arial" w:hAnsi="Arial" w:cs="Arial"/>
+                <w:lang w:val="es-ES" w:eastAsia="es-EC"/>
+              </w:rPr>
+              <w:t>Alta</w:t>
+            </w:r>
+          </w:p>
+        </w:tc>
+      </w:tr>
+      <w:tr>
+        <w:tc>
+          <w:tcPr>
+            <w:tcW w:w="1129" w:type="dxa"/>
+            <w:vAlign w:val="center"/>
+            <w:hideMark/>
+          </w:tcPr>
+          <w:p>
+            <w:pPr>
+              <w:spacing w:after="160"/>
+              <w:jc w:val="center"/>
+              <w:rPr>
+                <w:rFonts w:ascii="Arial" w:hAnsi="Arial" w:cs="Arial"/>
+                <w:lang w:val="es-ES" w:eastAsia="es-EC"/>
+              </w:rPr>
+            </w:pPr>
+            <w:r>
+              <w:rPr>
+                <w:rFonts w:ascii="Arial" w:hAnsi="Arial" w:cs="Arial"/>
+                <w:lang w:val="es-ES" w:eastAsia="es-EC"/>
+              </w:rPr>
+              <w:lastRenderedPageBreak/>
+              <w:t>RNF-04</w:t>
+            </w:r>
+          </w:p>
+        </w:tc>
+        <w:tc>
+          <w:tcPr>
+            <w:tcW w:w="1956" w:type="dxa"/>
+            <w:vAlign w:val="center"/>
+            <w:hideMark/>
+          </w:tcPr>
+          <w:p>
+            <w:pPr>
+              <w:spacing w:after="160"/>
+              <w:jc w:val="center"/>
+              <w:rPr>
+                <w:rFonts w:ascii="Arial" w:hAnsi="Arial" w:cs="Arial"/>
+                <w:lang w:val="es-ES" w:eastAsia="es-EC"/>
+              </w:rPr>
+            </w:pPr>
+            <w:r>
+              <w:rPr>
+                <w:rFonts w:ascii="Arial" w:hAnsi="Arial" w:cs="Arial"/>
+                <w:lang w:val="es-ES" w:eastAsia="es-EC"/>
+              </w:rPr>
+              <w:t>Seguridad</w:t>
+            </w:r>
+          </w:p>
+        </w:tc>
+        <w:tc>
+          <w:tcPr>
+            <w:tcW w:w="0" w:type="auto"/>
+            <w:hideMark/>
+          </w:tcPr>
+          <w:p>
+            <w:pPr>
+              <w:spacing w:after="160"/>
+              <w:rPr>
+                <w:rFonts w:ascii="Arial" w:hAnsi="Arial" w:cs="Arial"/>
+                <w:lang w:val="es-ES" w:eastAsia="es-EC"/>
+              </w:rPr>
+            </w:pPr>
+            <w:r>
+              <w:rPr>
+                <w:rFonts w:ascii="Arial" w:hAnsi="Arial" w:cs="Arial"/>
+                <w:lang w:val="es-ES" w:eastAsia="es-EC"/>
+              </w:rPr>
+              <w:t>Autenticación, autorización por roles (RBAC) y protección de datos sensibles</w:t>
+            </w:r>
+          </w:p>
+        </w:tc>
+        <w:tc>
+          <w:tcPr>
+            <w:tcW w:w="0" w:type="auto"/>
+            <w:vAlign w:val="center"/>
+            <w:hideMark/>
+          </w:tcPr>
+          <w:p>
+            <w:pPr>
+              <w:spacing w:after="160"/>
+              <w:jc w:val="center"/>
+              <w:rPr>
+                <w:rFonts w:ascii="Arial" w:hAnsi="Arial" w:cs="Arial"/>
+                <w:lang w:val="es-ES" w:eastAsia="es-EC"/>
+              </w:rPr>
+            </w:pPr>
+            <w:r>
+              <w:rPr>
+                <w:rFonts w:ascii="Arial" w:hAnsi="Arial" w:cs="Arial"/>
+                <w:lang w:val="es-ES" w:eastAsia="es-EC"/>
+              </w:rPr>
+              <w:t>Alta</w:t>
+            </w:r>
+          </w:p>
+        </w:tc>
+      </w:tr>
+      <w:tr>
+        <w:tc>
+          <w:tcPr>
+            <w:tcW w:w="1129" w:type="dxa"/>
+            <w:vAlign w:val="center"/>
+            <w:hideMark/>
+          </w:tcPr>
+          <w:p>
+            <w:pPr>
+              <w:spacing w:after="160"/>
+              <w:jc w:val="center"/>
+              <w:rPr>
+                <w:rFonts w:ascii="Arial" w:hAnsi="Arial" w:cs="Arial"/>
+                <w:lang w:val="es-ES" w:eastAsia="es-EC"/>
+              </w:rPr>
+            </w:pPr>
+            <w:r>
+              <w:rPr>
+                <w:rFonts w:ascii="Arial" w:hAnsi="Arial" w:cs="Arial"/>
+                <w:lang w:val="es-ES" w:eastAsia="es-EC"/>
+              </w:rPr>
+              <w:t>RNF-05</w:t>
+            </w:r>
+          </w:p>
+        </w:tc>
+        <w:tc>
+          <w:tcPr>
+            <w:tcW w:w="1956" w:type="dxa"/>
+            <w:vAlign w:val="center"/>
+            <w:hideMark/>
+          </w:tcPr>
+          <w:p>
+            <w:pPr>
+              <w:spacing w:after="160"/>
+              <w:jc w:val="center"/>
+              <w:rPr>
+                <w:rFonts w:ascii="Arial" w:hAnsi="Arial" w:cs="Arial"/>
+                <w:lang w:val="es-ES" w:eastAsia="es-EC"/>
+              </w:rPr>
+            </w:pPr>
+            <w:r>
+              <w:rPr>
+                <w:rFonts w:ascii="Arial" w:hAnsi="Arial" w:cs="Arial"/>
+                <w:lang w:val="es-ES" w:eastAsia="es-EC"/>
+              </w:rPr>
+              <w:t>Disponibilidad</w:t>
+            </w:r>
+          </w:p>
+        </w:tc>
+        <w:tc>
+          <w:tcPr>
+            <w:tcW w:w="0" w:type="auto"/>
+            <w:hideMark/>
+          </w:tcPr>
+          <w:p>
+            <w:pPr>
+              <w:spacing w:after="160"/>
+              <w:rPr>
+                <w:rFonts w:ascii="Arial" w:hAnsi="Arial" w:cs="Arial"/>
+                <w:lang w:val="es-ES" w:eastAsia="es-EC"/>
+              </w:rPr>
+            </w:pPr>
+            <w:r>
+              <w:rPr>
+                <w:rFonts w:ascii="Arial" w:hAnsi="Arial" w:cs="Arial"/>
+                <w:lang w:val="es-ES" w:eastAsia="es-EC"/>
+              </w:rPr>
+              <w:t>Sistema disponible 24/7 con recuperación ante fallos</w:t>
+            </w:r>
+          </w:p>
+        </w:tc>
+        <w:tc>
+          <w:tcPr>
+            <w:tcW w:w="0" w:type="auto"/>
+            <w:vAlign w:val="center"/>
+            <w:hideMark/>
+          </w:tcPr>
+          <w:p>
+            <w:pPr>
+              <w:spacing w:after="160"/>
+              <w:jc w:val="center"/>
+              <w:rPr>
+                <w:rFonts w:ascii="Arial" w:hAnsi="Arial" w:cs="Arial"/>
+                <w:lang w:val="es-ES" w:eastAsia="es-EC"/>
+              </w:rPr>
+            </w:pPr>
+            <w:r>
+              <w:rPr>
+                <w:rFonts w:ascii="Arial" w:hAnsi="Arial" w:cs="Arial"/>
+                <w:lang w:val="es-ES" w:eastAsia="es-EC"/>
+              </w:rPr>
+              <w:t>Alta</w:t>
+            </w:r>
+          </w:p>
+        </w:tc>
+      </w:tr>
+      <w:tr>
+        <w:tc>
+          <w:tcPr>
+            <w:tcW w:w="1129" w:type="dxa"/>
+            <w:vAlign w:val="center"/>
+            <w:hideMark/>
+          </w:tcPr>
+          <w:p>
+            <w:pPr>
+              <w:spacing w:after="160"/>
+              <w:jc w:val="center"/>
+              <w:rPr>
+                <w:rFonts w:ascii="Arial" w:hAnsi="Arial" w:cs="Arial"/>
+                <w:lang w:val="es-ES" w:eastAsia="es-EC"/>
+              </w:rPr>
+            </w:pPr>
+            <w:r>
+              <w:rPr>
+                <w:rFonts w:ascii="Arial" w:hAnsi="Arial" w:cs="Arial"/>
+                <w:lang w:val="es-ES" w:eastAsia="es-EC"/>
+              </w:rPr>
+              <w:t>RNF-06</w:t>
+            </w:r>
+          </w:p>
+        </w:tc>
+        <w:tc>
+          <w:tcPr>
+            <w:tcW w:w="1956" w:type="dxa"/>
+            <w:vAlign w:val="center"/>
+            <w:hideMark/>
+          </w:tcPr>
+          <w:p>
+            <w:pPr>
+              <w:spacing w:after="160"/>
+              <w:jc w:val="center"/>
+              <w:rPr>
+                <w:rFonts w:ascii="Arial" w:hAnsi="Arial" w:cs="Arial"/>
+                <w:lang w:val="es-ES" w:eastAsia="es-EC"/>
+              </w:rPr>
+            </w:pPr>
+            <w:r>
+              <w:rPr>
+                <w:rFonts w:ascii="Arial" w:hAnsi="Arial" w:cs="Arial"/>
+                <w:lang w:val="es-ES" w:eastAsia="es-EC"/>
+              </w:rPr>
+              <w:t>Usabilidad</w:t>
+            </w:r>
+          </w:p>
+        </w:tc>
+        <w:tc>
+          <w:tcPr>
+            <w:tcW w:w="0" w:type="auto"/>
+            <w:hideMark/>
+          </w:tcPr>
+          <w:p>
+            <w:pPr>
+              <w:spacing w:after="160"/>
+              <w:rPr>
+                <w:rFonts w:ascii="Arial" w:hAnsi="Arial" w:cs="Arial"/>
+                <w:lang w:val="es-ES" w:eastAsia="es-EC"/>
+              </w:rPr>
+            </w:pPr>
+            <w:r>
+              <w:rPr>
+                <w:rFonts w:ascii="Arial" w:hAnsi="Arial" w:cs="Arial"/>
+                <w:lang w:val="es-ES" w:eastAsia="es-EC"/>
+              </w:rPr>
+              <w:t>Interfaz intuitiva y responsive</w:t>
+            </w:r>
+          </w:p>
+        </w:tc>
+        <w:tc>
+          <w:tcPr>
+            <w:tcW w:w="0" w:type="auto"/>
+            <w:vAlign w:val="center"/>
+            <w:hideMark/>
+          </w:tcPr>
+          <w:p>
+            <w:pPr>
+              <w:spacing w:after="160"/>
+              <w:jc w:val="center"/>
+              <w:rPr>
+                <w:rFonts w:ascii="Arial" w:hAnsi="Arial" w:cs="Arial"/>
+                <w:lang w:val="es-ES" w:eastAsia="es-EC"/>
+              </w:rPr>
+            </w:pPr>
+            <w:r>
+              <w:rPr>
+                <w:rFonts w:ascii="Arial" w:hAnsi="Arial" w:cs="Arial"/>
+                <w:lang w:val="es-ES" w:eastAsia="es-EC"/>
+              </w:rPr>
+              <w:t>Alta</w:t>
+            </w:r>
+          </w:p>
+        </w:tc>
+      </w:tr>
+      <w:tr>
+        <w:tc>
+          <w:tcPr>
+            <w:tcW w:w="1129" w:type="dxa"/>
+            <w:vAlign w:val="center"/>
+            <w:hideMark/>
+          </w:tcPr>
+          <w:p>
+            <w:pPr>
+              <w:spacing w:after="160"/>
+              <w:jc w:val="center"/>
+              <w:rPr>
+                <w:rFonts w:ascii="Arial" w:hAnsi="Arial" w:cs="Arial"/>
+                <w:lang w:val="es-ES" w:eastAsia="es-EC"/>
+              </w:rPr>
+            </w:pPr>
+            <w:r>
+              <w:rPr>
+                <w:rFonts w:ascii="Arial" w:hAnsi="Arial" w:cs="Arial"/>
+                <w:lang w:val="es-ES" w:eastAsia="es-EC"/>
+              </w:rPr>
+              <w:t>RNF-07</w:t>
+            </w:r>
+          </w:p>
+        </w:tc>
+        <w:tc>
+          <w:tcPr>
+            <w:tcW w:w="1956" w:type="dxa"/>
+            <w:vAlign w:val="center"/>
+            <w:hideMark/>
+          </w:tcPr>
+          <w:p>
+            <w:pPr>
+              <w:spacing w:after="160"/>
+              <w:jc w:val="center"/>
+              <w:rPr>
+                <w:rFonts w:ascii="Arial" w:hAnsi="Arial" w:cs="Arial"/>
+                <w:lang w:val="es-ES" w:eastAsia="es-EC"/>
+              </w:rPr>
+            </w:pPr>
+            <w:r>
+              <w:rPr>
+                <w:rFonts w:ascii="Arial" w:hAnsi="Arial" w:cs="Arial"/>
+                <w:lang w:val="es-ES" w:eastAsia="es-EC"/>
+              </w:rPr>
+              <w:t>Rendimiento</w:t>
+            </w:r>
+          </w:p>
+        </w:tc>
+        <w:tc>
+          <w:tcPr>
+            <w:tcW w:w="0" w:type="auto"/>
+            <w:hideMark/>
+          </w:tcPr>
+          <w:p>
+            <w:pPr>
+              <w:spacing w:after="160"/>
+              <w:rPr>
+                <w:rFonts w:ascii="Arial" w:hAnsi="Arial" w:cs="Arial"/>
+                <w:lang w:val="es-ES" w:eastAsia="es-EC"/>
+              </w:rPr>
+            </w:pPr>
+            <w:r>
+              <w:rPr>
+                <w:rFonts w:ascii="Arial" w:hAnsi="Arial" w:cs="Arial"/>
+                <w:lang w:val="es-ES" w:eastAsia="es-EC"/>
+              </w:rPr>
+              <w:t>Tiempo de respuesta &lt; 2 segundos en operaciones principales</w:t>
+            </w:r>
+          </w:p>
+        </w:tc>
+        <w:tc>
+          <w:tcPr>
+            <w:tcW w:w="0" w:type="auto"/>
+            <w:vAlign w:val="center"/>
+            <w:hideMark/>
+          </w:tcPr>
+          <w:p>
+            <w:pPr>
+              <w:spacing w:after="160"/>
+              <w:jc w:val="center"/>
+              <w:rPr>
+                <w:rFonts w:ascii="Arial" w:hAnsi="Arial" w:cs="Arial"/>
+                <w:lang w:val="es-ES" w:eastAsia="es-EC"/>
+              </w:rPr>
+            </w:pPr>
+            <w:r>
+              <w:rPr>
+                <w:rFonts w:ascii="Arial" w:hAnsi="Arial" w:cs="Arial"/>
+                <w:lang w:val="es-ES" w:eastAsia="es-EC"/>
+              </w:rPr>
+              <w:t>Media</w:t>
+            </w:r>
+          </w:p>
+        </w:tc>
+      </w:tr>
+      <w:tr>
+        <w:tc>
+          <w:tcPr>
+            <w:tcW w:w="1129" w:type="dxa"/>
+            <w:vAlign w:val="center"/>
+            <w:hideMark/>
+          </w:tcPr>
+          <w:p>
+            <w:pPr>
+              <w:spacing w:after="160"/>
+              <w:jc w:val="center"/>
+              <w:rPr>
+                <w:rFonts w:ascii="Arial" w:hAnsi="Arial" w:cs="Arial"/>
+                <w:lang w:val="es-ES" w:eastAsia="es-EC"/>
+              </w:rPr>
+            </w:pPr>
+            <w:r>
+              <w:rPr>
+                <w:rFonts w:ascii="Arial" w:hAnsi="Arial" w:cs="Arial"/>
+                <w:lang w:val="es-ES" w:eastAsia="es-EC"/>
+              </w:rPr>
+              <w:t>RNF-08</w:t>
+            </w:r>
+          </w:p>
+        </w:tc>
+        <w:tc>
+          <w:tcPr>
+            <w:tcW w:w="1956" w:type="dxa"/>
+            <w:vAlign w:val="center"/>
+            <w:hideMark/>
+          </w:tcPr>
+          <w:p>
+            <w:pPr>
+              <w:spacing w:after="160"/>
+              <w:jc w:val="center"/>
+              <w:rPr>
+                <w:rFonts w:ascii="Arial" w:hAnsi="Arial" w:cs="Arial"/>
+                <w:lang w:val="es-ES" w:eastAsia="es-EC"/>
+              </w:rPr>
+            </w:pPr>
+            <w:r>
+              <w:rPr>
+                <w:rFonts w:ascii="Arial" w:hAnsi="Arial" w:cs="Arial"/>
+                <w:lang w:val="es-ES" w:eastAsia="es-EC"/>
+              </w:rPr>
+              <w:t>Portabilidad</w:t>
+            </w:r>
+          </w:p>
+        </w:tc>
+        <w:tc>
+          <w:tcPr>
+            <w:tcW w:w="0" w:type="auto"/>
+            <w:hideMark/>
+          </w:tcPr>
+          <w:p>
+            <w:pPr>
+              <w:spacing w:after="160"/>
+              <w:rPr>
+                <w:rFonts w:ascii="Arial" w:hAnsi="Arial" w:cs="Arial"/>
+                <w:lang w:val="es-ES" w:eastAsia="es-EC"/>
+              </w:rPr>
+            </w:pPr>
+            <w:r>
+              <w:rPr>
+                <w:rFonts w:ascii="Arial" w:hAnsi="Arial" w:cs="Arial"/>
+                <w:lang w:val="es-ES" w:eastAsia="es-EC"/>
+              </w:rPr>
+              <w:t>Independencia de plataforma (ejecutable en Windows, Linux, Cloud)</w:t>
+            </w:r>
+          </w:p>
+        </w:tc>
+        <w:tc>
+          <w:tcPr>
+            <w:tcW w:w="0" w:type="auto"/>
+            <w:vAlign w:val="center"/>
+            <w:hideMark/>
+          </w:tcPr>
+          <w:p>
+            <w:pPr>
+              <w:spacing w:after="160"/>
+              <w:jc w:val="center"/>
+              <w:rPr>
+                <w:rFonts w:ascii="Arial" w:hAnsi="Arial" w:cs="Arial"/>
+                <w:lang w:val="es-ES" w:eastAsia="es-EC"/>
+              </w:rPr>
+            </w:pPr>
+            <w:r>
+              <w:rPr>
+                <w:rFonts w:ascii="Arial" w:hAnsi="Arial" w:cs="Arial"/>
+                <w:lang w:val="es-ES" w:eastAsia="es-EC"/>
+              </w:rPr>
+              <w:t>Media</w:t>
+            </w:r>
+          </w:p>
+        </w:tc>
+      </w:tr>
+      <w:tr>
+        <w:tc>
+          <w:tcPr>
+            <w:tcW w:w="1129" w:type="dxa"/>
+            <w:vAlign w:val="center"/>
+            <w:hideMark/>
+          </w:tcPr>
+          <w:p>
+            <w:pPr>
+              <w:spacing w:after="160"/>
+              <w:jc w:val="center"/>
+              <w:rPr>
+                <w:rFonts w:ascii="Arial" w:hAnsi="Arial" w:cs="Arial"/>
+                <w:lang w:val="es-ES" w:eastAsia="es-EC"/>
+              </w:rPr>
+            </w:pPr>
+            <w:r>
+              <w:rPr>
+                <w:rFonts w:ascii="Arial" w:hAnsi="Arial" w:cs="Arial"/>
+                <w:lang w:val="es-ES" w:eastAsia="es-EC"/>
+              </w:rPr>
+              <w:t>RNF-09</w:t>
+            </w:r>
+          </w:p>
+        </w:tc>
+        <w:tc>
+          <w:tcPr>
+            <w:tcW w:w="1956" w:type="dxa"/>
+            <w:vAlign w:val="center"/>
+            <w:hideMark/>
+          </w:tcPr>
+          <w:p>
+            <w:pPr>
+              <w:spacing w:after="160"/>
+              <w:jc w:val="center"/>
+              <w:rPr>
+                <w:rFonts w:ascii="Arial" w:hAnsi="Arial" w:cs="Arial"/>
+                <w:lang w:val="es-ES" w:eastAsia="es-EC"/>
+              </w:rPr>
+            </w:pPr>
+            <w:r>
+              <w:rPr>
+                <w:rFonts w:ascii="Arial" w:hAnsi="Arial" w:cs="Arial"/>
+                <w:lang w:val="es-ES" w:eastAsia="es-EC"/>
+              </w:rPr>
+              <w:t>Auditoría y Cumplimiento</w:t>
+            </w:r>
+          </w:p>
+        </w:tc>
+        <w:tc>
+          <w:tcPr>
+            <w:tcW w:w="0" w:type="auto"/>
+            <w:hideMark/>
+          </w:tcPr>
+          <w:p>
+            <w:pPr>
+              <w:spacing w:after="160"/>
+              <w:rPr>
+                <w:rFonts w:ascii="Arial" w:hAnsi="Arial" w:cs="Arial"/>
+                <w:lang w:val="es-ES" w:eastAsia="es-EC"/>
+              </w:rPr>
+            </w:pPr>
+            <w:r>
+              <w:rPr>
+                <w:rFonts w:ascii="Arial" w:hAnsi="Arial" w:cs="Arial"/>
+                <w:lang w:val="es-ES" w:eastAsia="es-EC"/>
+              </w:rPr>
+              <w:t>Registro completo de acciones para auditorías internas</w:t>
+            </w:r>
+          </w:p>
+        </w:tc>
+        <w:tc>
+          <w:tcPr>
+            <w:tcW w:w="0" w:type="auto"/>
+            <w:vAlign w:val="center"/>
+            <w:hideMark/>
+          </w:tcPr>
+          <w:p>
+            <w:pPr>
+              <w:spacing w:after="160"/>
+              <w:jc w:val="center"/>
+              <w:rPr>
+                <w:rFonts w:ascii="Arial" w:hAnsi="Arial" w:cs="Arial"/>
+                <w:lang w:val="es-ES" w:eastAsia="es-EC"/>
+              </w:rPr>
+            </w:pPr>
+            <w:r>
+              <w:rPr>
+                <w:rFonts w:ascii="Arial" w:hAnsi="Arial" w:cs="Arial"/>
+                <w:lang w:val="es-ES" w:eastAsia="es-EC"/>
+              </w:rPr>
+              <w:t>Alta</w:t>
+            </w:r>
+          </w:p>
+        </w:tc>
+      </w:tr>
+      <w:tr>
+        <w:tc>
+          <w:tcPr>
+            <w:tcW w:w="1129" w:type="dxa"/>
+            <w:vAlign w:val="center"/>
+            <w:hideMark/>
+          </w:tcPr>
+          <w:p>
+            <w:pPr>
+              <w:spacing w:after="160"/>
+              <w:jc w:val="center"/>
+              <w:rPr>
+                <w:rFonts w:ascii="Arial" w:hAnsi="Arial" w:cs="Arial"/>
+                <w:lang w:val="es-ES" w:eastAsia="es-EC"/>
+              </w:rPr>
+            </w:pPr>
+            <w:r>
+              <w:rPr>
+                <w:rFonts w:ascii="Arial" w:hAnsi="Arial" w:cs="Arial"/>
+                <w:lang w:val="es-ES" w:eastAsia="es-EC"/>
+              </w:rPr>
+              <w:t>RNF-10</w:t>
+            </w:r>
+          </w:p>
+        </w:tc>
+        <w:tc>
+          <w:tcPr>
+            <w:tcW w:w="1956" w:type="dxa"/>
+            <w:vAlign w:val="center"/>
+            <w:hideMark/>
+          </w:tcPr>
+          <w:p>
+            <w:pPr>
+              <w:spacing w:after="160"/>
+              <w:jc w:val="center"/>
+              <w:rPr>
+                <w:rFonts w:ascii="Arial" w:hAnsi="Arial" w:cs="Arial"/>
+                <w:lang w:val="es-ES" w:eastAsia="es-EC"/>
+              </w:rPr>
+            </w:pPr>
+            <w:r>
+              <w:rPr>
+                <w:rFonts w:ascii="Arial" w:hAnsi="Arial" w:cs="Arial"/>
+                <w:lang w:val="es-ES" w:eastAsia="es-EC"/>
+              </w:rPr>
+              <w:t>Integración</w:t>
+            </w:r>
+          </w:p>
+        </w:tc>
+        <w:tc>
+          <w:tcPr>
+            <w:tcW w:w="0" w:type="auto"/>
+            <w:hideMark/>
+          </w:tcPr>
+          <w:p>
+            <w:pPr>
+              <w:spacing w:after="160"/>
+              <w:rPr>
+                <w:rFonts w:ascii="Arial" w:hAnsi="Arial" w:cs="Arial"/>
+                <w:lang w:val="es-ES" w:eastAsia="es-EC"/>
+              </w:rPr>
+            </w:pPr>
+            <w:r>
+              <w:rPr>
+                <w:rFonts w:ascii="Arial" w:hAnsi="Arial" w:cs="Arial"/>
+                <w:lang w:val="es-ES" w:eastAsia="es-EC"/>
+              </w:rPr>
+              <w:t>Posibilidad de integración futura con sistemas de monitoreo del Data Center</w:t>
+            </w:r>
+          </w:p>
+        </w:tc>
+        <w:tc>
+          <w:tcPr>
+            <w:tcW w:w="0" w:type="auto"/>
+            <w:vAlign w:val="center"/>
+            <w:hideMark/>
+          </w:tcPr>
+          <w:p>
+            <w:pPr>
+              <w:spacing w:after="160"/>
+              <w:jc w:val="center"/>
+              <w:rPr>
+                <w:rFonts w:ascii="Arial" w:hAnsi="Arial" w:cs="Arial"/>
+                <w:lang w:val="es-ES" w:eastAsia="es-EC"/>
+              </w:rPr>
+            </w:pPr>
+            <w:r>
+              <w:rPr>
+                <w:rFonts w:ascii="Arial" w:hAnsi="Arial" w:cs="Arial"/>
+                <w:lang w:val="es-ES" w:eastAsia="es-EC"/>
+              </w:rPr>
+              <w:t>Media</w:t>
+            </w:r>
+          </w:p>
+        </w:tc>
+      </w:tr>
+    </w:tbl>
     <w:p>
       <w:pPr>
         <w:rPr>

</xml_diff>